<commit_message>
docs(g3-14): address risk plan review findings
</commit_message>
<xml_diff>
--- a/docs/deliverables/23-风险管理计划与风险登记册v2.docx
+++ b/docs/deliverables/23-风险管理计划与风险登记册v2.docx
@@ -11,7 +11,7 @@
         <w:rPr>
           <w:rFonts w:ascii="Times New Roman" w:hAnsi="Times New Roman" w:eastAsia="宋体"/>
         </w:rPr>
-        <w:t>文档编号：YJGL-G3-14-RMP　　版本号：V0.1</w:t>
+        <w:t>文档编号：YJGL-G3-14-RMP　　版本号：V0.2</w:t>
       </w:r>
     </w:p>
     <w:p>
@@ -134,7 +134,7 @@
         <w:rPr>
           <w:rFonts w:ascii="Times New Roman" w:hAnsi="Times New Roman" w:eastAsia="宋体"/>
         </w:rPr>
-        <w:t>编制日期：2026 年 9 月 20 日</w:t>
+        <w:t>编制日期：2026 年 9 月 21 日</w:t>
       </w:r>
     </w:p>
     <w:p>
@@ -410,6 +410,113 @@
           </w:p>
         </w:tc>
       </w:tr>
+      <w:tr>
+        <w:tc>
+          <w:tcPr>
+            <w:tcW w:type="dxa" w:w="1088"/>
+            <w:vAlign w:val="center"/>
+          </w:tcPr>
+          <w:p>
+            <w:pPr>
+              <w:spacing w:after="0" w:line="240" w:lineRule="auto"/>
+              <w:jc w:val="left"/>
+            </w:pPr>
+            <w:r/>
+            <w:r>
+              <w:rPr>
+                <w:rFonts w:ascii="Times New Roman" w:hAnsi="Times New Roman" w:eastAsia="宋体"/>
+                <w:b w:val="0"/>
+                <w:sz w:val="15"/>
+              </w:rPr>
+              <w:t>V0.2</w:t>
+            </w:r>
+          </w:p>
+        </w:tc>
+        <w:tc>
+          <w:tcPr>
+            <w:tcW w:type="dxa" w:w="1360"/>
+            <w:vAlign w:val="center"/>
+          </w:tcPr>
+          <w:p>
+            <w:pPr>
+              <w:spacing w:after="0" w:line="240" w:lineRule="auto"/>
+              <w:jc w:val="left"/>
+            </w:pPr>
+            <w:r/>
+            <w:r>
+              <w:rPr>
+                <w:rFonts w:ascii="Times New Roman" w:hAnsi="Times New Roman" w:eastAsia="宋体"/>
+                <w:b w:val="0"/>
+                <w:sz w:val="15"/>
+              </w:rPr>
+              <w:t>2026-09-21</w:t>
+            </w:r>
+          </w:p>
+        </w:tc>
+        <w:tc>
+          <w:tcPr>
+            <w:tcW w:type="dxa" w:w="3265"/>
+            <w:vAlign w:val="center"/>
+          </w:tcPr>
+          <w:p>
+            <w:pPr>
+              <w:spacing w:after="0" w:line="240" w:lineRule="auto"/>
+              <w:jc w:val="left"/>
+            </w:pPr>
+            <w:r/>
+            <w:r>
+              <w:rPr>
+                <w:rFonts w:ascii="Times New Roman" w:hAnsi="Times New Roman" w:eastAsia="宋体"/>
+                <w:b w:val="0"/>
+                <w:sz w:val="15"/>
+              </w:rPr>
+              <w:t>§2—§9</w:t>
+            </w:r>
+          </w:p>
+        </w:tc>
+        <w:tc>
+          <w:tcPr>
+            <w:tcW w:type="dxa" w:w="1360"/>
+            <w:vAlign w:val="center"/>
+          </w:tcPr>
+          <w:p>
+            <w:pPr>
+              <w:spacing w:after="0" w:line="240" w:lineRule="auto"/>
+              <w:jc w:val="left"/>
+            </w:pPr>
+            <w:r/>
+            <w:r>
+              <w:rPr>
+                <w:rFonts w:ascii="Times New Roman" w:hAnsi="Times New Roman" w:eastAsia="宋体"/>
+                <w:b w:val="0"/>
+                <w:sz w:val="15"/>
+              </w:rPr>
+              <w:t>按 ISSUE-G3-14-001/002 统一风险评分分组，并为 7 张业务表补齐连续、紧邻的编号题注；风险 ID、P/I、责任、应对和 Issue 状态不变。</w:t>
+            </w:r>
+          </w:p>
+        </w:tc>
+        <w:tc>
+          <w:tcPr>
+            <w:tcW w:type="dxa" w:w="1995"/>
+            <w:vAlign w:val="center"/>
+          </w:tcPr>
+          <w:p>
+            <w:pPr>
+              <w:spacing w:after="0" w:line="240" w:lineRule="auto"/>
+              <w:jc w:val="left"/>
+            </w:pPr>
+            <w:r/>
+            <w:r>
+              <w:rPr>
+                <w:rFonts w:ascii="Times New Roman" w:hAnsi="Times New Roman" w:eastAsia="宋体"/>
+                <w:b w:val="0"/>
+                <w:sz w:val="15"/>
+              </w:rPr>
+              <w:t>何思源</w:t>
+            </w:r>
+          </w:p>
+        </w:tc>
+      </w:tr>
     </w:tbl>
     <w:p>
       <w:pPr>
@@ -499,7 +606,7 @@
         <w:tab/>
       </w:r>
       <w:r>
-        <w:t>2</w:t>
+        <w:t>1</w:t>
       </w:r>
     </w:p>
     <w:p>
@@ -516,7 +623,7 @@
         <w:tab/>
       </w:r>
       <w:r>
-        <w:t>2</w:t>
+        <w:t>1</w:t>
       </w:r>
     </w:p>
     <w:p>
@@ -533,7 +640,7 @@
         <w:tab/>
       </w:r>
       <w:r>
-        <w:t>2</w:t>
+        <w:t>1</w:t>
       </w:r>
     </w:p>
     <w:p>
@@ -567,7 +674,7 @@
         <w:tab/>
       </w:r>
       <w:r>
-        <w:t>3</w:t>
+        <w:t>2</w:t>
       </w:r>
     </w:p>
     <w:p>
@@ -584,7 +691,7 @@
         <w:tab/>
       </w:r>
       <w:r>
-        <w:t>3</w:t>
+        <w:t>2</w:t>
       </w:r>
     </w:p>
     <w:p>
@@ -595,13 +702,13 @@
         </w:tabs>
       </w:pPr>
       <w:r>
-        <w:t>4.2 中低风险与持续监测</w:t>
+        <w:t>4.2 当前中风险与持续监测</w:t>
       </w:r>
       <w:r>
         <w:tab/>
       </w:r>
       <w:r>
-        <w:t>5</w:t>
+        <w:t>4</w:t>
       </w:r>
     </w:p>
     <w:p>
@@ -618,7 +725,7 @@
         <w:tab/>
       </w:r>
       <w:r>
-        <w:t>6</w:t>
+        <w:t>4</w:t>
       </w:r>
     </w:p>
     <w:p>
@@ -635,7 +742,7 @@
         <w:tab/>
       </w:r>
       <w:r>
-        <w:t>6</w:t>
+        <w:t>4</w:t>
       </w:r>
     </w:p>
     <w:p>
@@ -652,7 +759,7 @@
         <w:tab/>
       </w:r>
       <w:r>
-        <w:t>7</w:t>
+        <w:t>5</w:t>
       </w:r>
     </w:p>
     <w:p>
@@ -669,7 +776,7 @@
         <w:tab/>
       </w:r>
       <w:r>
-        <w:t>7</w:t>
+        <w:t>5</w:t>
       </w:r>
     </w:p>
     <w:p>
@@ -686,7 +793,7 @@
         <w:tab/>
       </w:r>
       <w:r>
-        <w:t>8</w:t>
+        <w:t>5</w:t>
       </w:r>
     </w:p>
     <w:p>
@@ -788,398 +895,19 @@
         <w:t>依据为冻结 M2 基线、G3-01 设计输入、G3-03—09 设计与测试成果、项目/质量/配置管理计划、现有风险登记册、control/issues.md 与变更记录。发生矛盾时依次服从真实需求、任务书、受控事实与数字、已批准变更；教学样例仅提供物理版式。</w:t>
       </w:r>
     </w:p>
-    <w:tbl>
-      <w:tblPr>
-        <w:tblW w:type="auto" w:w="0"/>
-        <w:tblLayout w:type="fixed"/>
-        <w:tblLook w:firstColumn="1" w:firstRow="1" w:lastColumn="0" w:lastRow="0" w:noHBand="0" w:noVBand="1" w:val="04A0"/>
-      </w:tblPr>
-      <w:tblGrid>
-        <w:gridCol w:w="1512"/>
-        <w:gridCol w:w="3024"/>
-        <w:gridCol w:w="4536"/>
-      </w:tblGrid>
-      <w:tr>
-        <w:trPr>
-          <w:tblHeader w:val="true"/>
-        </w:trPr>
-        <w:tc>
-          <w:tcPr>
-            <w:tcW w:type="dxa" w:w="1512"/>
-            <w:vAlign w:val="center"/>
-          </w:tcPr>
-          <w:p>
-            <w:pPr>
-              <w:spacing w:after="0" w:line="240" w:lineRule="auto"/>
-              <w:jc w:val="left"/>
-            </w:pPr>
-            <w:r/>
-            <w:r>
-              <w:rPr>
-                <w:rFonts w:ascii="Times New Roman" w:hAnsi="Times New Roman" w:eastAsia="宋体"/>
-                <w:b/>
-                <w:sz w:val="17"/>
-              </w:rPr>
-              <w:t>角色</w:t>
-            </w:r>
-          </w:p>
-        </w:tc>
-        <w:tc>
-          <w:tcPr>
-            <w:tcW w:type="dxa" w:w="3024"/>
-            <w:vAlign w:val="center"/>
-          </w:tcPr>
-          <w:p>
-            <w:pPr>
-              <w:spacing w:after="0" w:line="240" w:lineRule="auto"/>
-              <w:jc w:val="left"/>
-            </w:pPr>
-            <w:r/>
-            <w:r>
-              <w:rPr>
-                <w:rFonts w:ascii="Times New Roman" w:hAnsi="Times New Roman" w:eastAsia="宋体"/>
-                <w:b/>
-                <w:sz w:val="17"/>
-              </w:rPr>
-              <w:t>职责</w:t>
-            </w:r>
-          </w:p>
-        </w:tc>
-        <w:tc>
-          <w:tcPr>
-            <w:tcW w:type="dxa" w:w="4536"/>
-            <w:vAlign w:val="center"/>
-          </w:tcPr>
-          <w:p>
-            <w:pPr>
-              <w:spacing w:after="0" w:line="240" w:lineRule="auto"/>
-              <w:jc w:val="left"/>
-            </w:pPr>
-            <w:r/>
-            <w:r>
-              <w:rPr>
-                <w:rFonts w:ascii="Times New Roman" w:hAnsi="Times New Roman" w:eastAsia="宋体"/>
-                <w:b/>
-                <w:sz w:val="17"/>
-              </w:rPr>
-              <w:t>本任务边界</w:t>
-            </w:r>
-          </w:p>
-        </w:tc>
-      </w:tr>
-      <w:tr>
-        <w:tc>
-          <w:tcPr>
-            <w:tcW w:type="dxa" w:w="1512"/>
-            <w:vAlign w:val="center"/>
-          </w:tcPr>
-          <w:p>
-            <w:pPr>
-              <w:spacing w:after="0" w:line="240" w:lineRule="auto"/>
-              <w:jc w:val="left"/>
-            </w:pPr>
-            <w:r/>
-            <w:r>
-              <w:rPr>
-                <w:rFonts w:ascii="Times New Roman" w:hAnsi="Times New Roman" w:eastAsia="宋体"/>
-                <w:b w:val="0"/>
-                <w:sz w:val="17"/>
-              </w:rPr>
-              <w:t>A 项目负责人</w:t>
-            </w:r>
-          </w:p>
-        </w:tc>
-        <w:tc>
-          <w:tcPr>
-            <w:tcW w:type="dxa" w:w="3024"/>
-            <w:vAlign w:val="center"/>
-          </w:tcPr>
-          <w:p>
-            <w:pPr>
-              <w:spacing w:after="0" w:line="240" w:lineRule="auto"/>
-              <w:jc w:val="left"/>
-            </w:pPr>
-            <w:r/>
-            <w:r>
-              <w:rPr>
-                <w:rFonts w:ascii="Times New Roman" w:hAnsi="Times New Roman" w:eastAsia="宋体"/>
-                <w:b w:val="0"/>
-                <w:sz w:val="17"/>
-              </w:rPr>
-              <w:t>维护计划和登记册，协调责任人，主持升级与跨域处置</w:t>
-            </w:r>
-          </w:p>
-        </w:tc>
-        <w:tc>
-          <w:tcPr>
-            <w:tcW w:type="dxa" w:w="4536"/>
-            <w:vAlign w:val="center"/>
-          </w:tcPr>
-          <w:p>
-            <w:pPr>
-              <w:spacing w:after="0" w:line="240" w:lineRule="auto"/>
-              <w:jc w:val="left"/>
-            </w:pPr>
-            <w:r/>
-            <w:r>
-              <w:rPr>
-                <w:rFonts w:ascii="Times New Roman" w:hAnsi="Times New Roman" w:eastAsia="宋体"/>
-                <w:b w:val="0"/>
-                <w:sz w:val="17"/>
-              </w:rPr>
-              <w:t>G3-14 主责；不得代替 Issue/变更授权人关闭事项</w:t>
-            </w:r>
-          </w:p>
-        </w:tc>
-      </w:tr>
-      <w:tr>
-        <w:tc>
-          <w:tcPr>
-            <w:tcW w:type="dxa" w:w="1512"/>
-            <w:vAlign w:val="center"/>
-          </w:tcPr>
-          <w:p>
-            <w:pPr>
-              <w:spacing w:after="0" w:line="240" w:lineRule="auto"/>
-              <w:jc w:val="left"/>
-            </w:pPr>
-            <w:r/>
-            <w:r>
-              <w:rPr>
-                <w:rFonts w:ascii="Times New Roman" w:hAnsi="Times New Roman" w:eastAsia="宋体"/>
-                <w:b w:val="0"/>
-                <w:sz w:val="17"/>
-              </w:rPr>
-              <w:t>B 技术负责人</w:t>
-            </w:r>
-          </w:p>
-        </w:tc>
-        <w:tc>
-          <w:tcPr>
-            <w:tcW w:type="dxa" w:w="3024"/>
-            <w:vAlign w:val="center"/>
-          </w:tcPr>
-          <w:p>
-            <w:pPr>
-              <w:spacing w:after="0" w:line="240" w:lineRule="auto"/>
-              <w:jc w:val="left"/>
-            </w:pPr>
-            <w:r/>
-            <w:r>
-              <w:rPr>
-                <w:rFonts w:ascii="Times New Roman" w:hAnsi="Times New Roman" w:eastAsia="宋体"/>
-                <w:b w:val="0"/>
-                <w:sz w:val="17"/>
-              </w:rPr>
-              <w:t>识别技术、接口与 NFR 风险，核对技术应对与证据</w:t>
-            </w:r>
-          </w:p>
-        </w:tc>
-        <w:tc>
-          <w:tcPr>
-            <w:tcW w:type="dxa" w:w="4536"/>
-            <w:vAlign w:val="center"/>
-          </w:tcPr>
-          <w:p>
-            <w:pPr>
-              <w:spacing w:after="0" w:line="240" w:lineRule="auto"/>
-              <w:jc w:val="left"/>
-            </w:pPr>
-            <w:r/>
-            <w:r>
-              <w:rPr>
-                <w:rFonts w:ascii="Times New Roman" w:hAnsi="Times New Roman" w:eastAsia="宋体"/>
-                <w:b w:val="0"/>
-                <w:sz w:val="17"/>
-              </w:rPr>
-              <w:t>G3-14 唯一 Review 人</w:t>
-            </w:r>
-          </w:p>
-        </w:tc>
-      </w:tr>
-      <w:tr>
-        <w:tc>
-          <w:tcPr>
-            <w:tcW w:type="dxa" w:w="1512"/>
-            <w:vAlign w:val="center"/>
-          </w:tcPr>
-          <w:p>
-            <w:pPr>
-              <w:spacing w:after="0" w:line="240" w:lineRule="auto"/>
-              <w:jc w:val="left"/>
-            </w:pPr>
-            <w:r/>
-            <w:r>
-              <w:rPr>
-                <w:rFonts w:ascii="Times New Roman" w:hAnsi="Times New Roman" w:eastAsia="宋体"/>
-                <w:b w:val="0"/>
-                <w:sz w:val="17"/>
-              </w:rPr>
-              <w:t>C 需求与质量负责人</w:t>
-            </w:r>
-          </w:p>
-        </w:tc>
-        <w:tc>
-          <w:tcPr>
-            <w:tcW w:type="dxa" w:w="3024"/>
-            <w:vAlign w:val="center"/>
-          </w:tcPr>
-          <w:p>
-            <w:pPr>
-              <w:spacing w:after="0" w:line="240" w:lineRule="auto"/>
-              <w:jc w:val="left"/>
-            </w:pPr>
-            <w:r/>
-            <w:r>
-              <w:rPr>
-                <w:rFonts w:ascii="Times New Roman" w:hAnsi="Times New Roman" w:eastAsia="宋体"/>
-                <w:b w:val="0"/>
-                <w:sz w:val="17"/>
-              </w:rPr>
-              <w:t>提供合规、追踪、关键数字与验收风险输入</w:t>
-            </w:r>
-          </w:p>
-        </w:tc>
-        <w:tc>
-          <w:tcPr>
-            <w:tcW w:type="dxa" w:w="4536"/>
-            <w:vAlign w:val="center"/>
-          </w:tcPr>
-          <w:p>
-            <w:pPr>
-              <w:spacing w:after="0" w:line="240" w:lineRule="auto"/>
-              <w:jc w:val="left"/>
-            </w:pPr>
-            <w:r/>
-            <w:r>
-              <w:rPr>
-                <w:rFonts w:ascii="Times New Roman" w:hAnsi="Times New Roman" w:eastAsia="宋体"/>
-                <w:b w:val="0"/>
-                <w:sz w:val="17"/>
-              </w:rPr>
-              <w:t>不承担本文件 Review</w:t>
-            </w:r>
-          </w:p>
-        </w:tc>
-      </w:tr>
-      <w:tr>
-        <w:tc>
-          <w:tcPr>
-            <w:tcW w:type="dxa" w:w="1512"/>
-            <w:vAlign w:val="center"/>
-          </w:tcPr>
-          <w:p>
-            <w:pPr>
-              <w:spacing w:after="0" w:line="240" w:lineRule="auto"/>
-              <w:jc w:val="left"/>
-            </w:pPr>
-            <w:r/>
-            <w:r>
-              <w:rPr>
-                <w:rFonts w:ascii="Times New Roman" w:hAnsi="Times New Roman" w:eastAsia="宋体"/>
-                <w:b w:val="0"/>
-                <w:sz w:val="17"/>
-              </w:rPr>
-              <w:t>风险责任人</w:t>
-            </w:r>
-          </w:p>
-        </w:tc>
-        <w:tc>
-          <w:tcPr>
-            <w:tcW w:type="dxa" w:w="3024"/>
-            <w:vAlign w:val="center"/>
-          </w:tcPr>
-          <w:p>
-            <w:pPr>
-              <w:spacing w:after="0" w:line="240" w:lineRule="auto"/>
-              <w:jc w:val="left"/>
-            </w:pPr>
-            <w:r/>
-            <w:r>
-              <w:rPr>
-                <w:rFonts w:ascii="Times New Roman" w:hAnsi="Times New Roman" w:eastAsia="宋体"/>
-                <w:b w:val="0"/>
-                <w:sz w:val="17"/>
-              </w:rPr>
-              <w:t>监测触发器、执行预防/缓解、提交证据与关闭建议</w:t>
-            </w:r>
-          </w:p>
-        </w:tc>
-        <w:tc>
-          <w:tcPr>
-            <w:tcW w:type="dxa" w:w="4536"/>
-            <w:vAlign w:val="center"/>
-          </w:tcPr>
-          <w:p>
-            <w:pPr>
-              <w:spacing w:after="0" w:line="240" w:lineRule="auto"/>
-              <w:jc w:val="left"/>
-            </w:pPr>
-            <w:r/>
-            <w:r>
-              <w:rPr>
-                <w:rFonts w:ascii="Times New Roman" w:hAnsi="Times New Roman" w:eastAsia="宋体"/>
-                <w:b w:val="0"/>
-                <w:sz w:val="17"/>
-              </w:rPr>
-              <w:t>一项风险只指定一名牵头角色，可协同但不可转移责任</w:t>
-            </w:r>
-          </w:p>
-        </w:tc>
-      </w:tr>
-    </w:tbl>
     <w:p>
       <w:pPr>
-        <w:spacing w:after="100" w:line="300" w:lineRule="auto"/>
-        <w:ind w:firstLine="480"/>
-        <w:jc w:val="both"/>
-      </w:pPr>
-      <w:r>
-        <w:rPr>
-          <w:rFonts w:ascii="Times New Roman" w:hAnsi="Times New Roman" w:eastAsia="宋体"/>
-          <w:sz w:val="21"/>
-        </w:rPr>
-        <w:t>风险是可能发生的不确定事件；Issue 是已经发生且需跟踪的问题；缺陷进入缺陷流程；改变基线、范围、接口或指标的处置进入 CR/CCB。风险触发后不得只改风险状态：已成事实则创建或关联 Issue，需改基线则提交 CR，发布阻断按质量与配置门禁处理。</w:t>
-      </w:r>
-    </w:p>
-    <w:p>
-      <w:pPr>
-        <w:pStyle w:val="1"/>
         <w:keepNext/>
+        <w:spacing w:before="80" w:after="60"/>
+        <w:jc w:val="center"/>
       </w:pPr>
       <w:r>
         <w:rPr>
           <w:rFonts w:ascii="Times New Roman" w:hAnsi="Times New Roman" w:eastAsia="黑体"/>
           <w:b/>
+          <w:sz w:val="18"/>
         </w:rPr>
-        <w:t>3.1 识别与分类</w:t>
-      </w:r>
-    </w:p>
-    <w:p>
-      <w:pPr>
-        <w:spacing w:after="100" w:line="300" w:lineRule="auto"/>
-        <w:ind w:firstLine="480"/>
-        <w:jc w:val="both"/>
-      </w:pPr>
-      <w:r>
-        <w:rPr>
-          <w:rFonts w:ascii="Times New Roman" w:hAnsi="Times New Roman" w:eastAsia="宋体"/>
-          <w:sz w:val="21"/>
-        </w:rPr>
-        <w:t>每周例会、里程碑评审、需求/设计/测试 Review、接口联调、监控告警、缺陷趋势、变更影响和复盘均可提出风险。风险陈述至少包含原因、可能事件、影响；分类采用范围/需求、外部依赖、技术/接口、数据、NFR/安全、进度/资源、质量/配置、运维/发布。</w:t>
-      </w:r>
-    </w:p>
-    <w:p>
-      <w:pPr>
-        <w:pStyle w:val="1"/>
-        <w:keepNext/>
-      </w:pPr>
-      <w:r>
-        <w:rPr>
-          <w:rFonts w:ascii="Times New Roman" w:hAnsi="Times New Roman" w:eastAsia="黑体"/>
-          <w:b/>
-        </w:rPr>
-        <w:t>3.2 概率与影响</w:t>
+        <w:t>表 2-1 风险治理角色职责与边界</w:t>
       </w:r>
     </w:p>
     <w:tbl>
@@ -1214,7 +942,7 @@
                 <w:b/>
                 <w:sz w:val="17"/>
               </w:rPr>
-              <w:t>分值</w:t>
+              <w:t>角色</w:t>
             </w:r>
           </w:p>
         </w:tc>
@@ -1235,7 +963,7 @@
                 <w:b/>
                 <w:sz w:val="17"/>
               </w:rPr>
-              <w:t>概率判定</w:t>
+              <w:t>职责</w:t>
             </w:r>
           </w:p>
         </w:tc>
@@ -1256,7 +984,7 @@
                 <w:b/>
                 <w:sz w:val="17"/>
               </w:rPr>
-              <w:t>影响判定</w:t>
+              <w:t>本任务边界</w:t>
             </w:r>
           </w:p>
         </w:tc>
@@ -1279,7 +1007,7 @@
                 <w:b w:val="0"/>
                 <w:sz w:val="17"/>
               </w:rPr>
-              <w:t>1</w:t>
+              <w:t>A 项目负责人</w:t>
             </w:r>
           </w:p>
         </w:tc>
@@ -1300,7 +1028,7 @@
                 <w:b w:val="0"/>
                 <w:sz w:val="17"/>
               </w:rPr>
-              <w:t>极少，当前无迹象</w:t>
+              <w:t>维护计划和登记册，协调责任人，主持升级与跨域处置</w:t>
             </w:r>
           </w:p>
         </w:tc>
@@ -1321,7 +1049,7 @@
                 <w:b w:val="0"/>
                 <w:sz w:val="17"/>
               </w:rPr>
-              <w:t>可在责任人日常工作内吸收，不影响门禁</w:t>
+              <w:t>G3-14 主责；不得代替 Issue/变更授权人关闭事项</w:t>
             </w:r>
           </w:p>
         </w:tc>
@@ -1344,7 +1072,7 @@
                 <w:b w:val="0"/>
                 <w:sz w:val="17"/>
               </w:rPr>
-              <w:t>2</w:t>
+              <w:t>B 技术负责人</w:t>
             </w:r>
           </w:p>
         </w:tc>
@@ -1365,7 +1093,7 @@
                 <w:b w:val="0"/>
                 <w:sz w:val="17"/>
               </w:rPr>
-              <w:t>较低，有替代方案且依赖稳定</w:t>
+              <w:t>识别技术、接口与 NFR 风险，核对技术应对与证据</w:t>
             </w:r>
           </w:p>
         </w:tc>
@@ -1386,7 +1114,7 @@
                 <w:b w:val="0"/>
                 <w:sz w:val="17"/>
               </w:rPr>
-              <w:t>小范围返工，不改变关键路径</w:t>
+              <w:t>G3-14 唯一 Review 人</w:t>
             </w:r>
           </w:p>
         </w:tc>
@@ -1409,7 +1137,7 @@
                 <w:b w:val="0"/>
                 <w:sz w:val="17"/>
               </w:rPr>
-              <w:t>3</w:t>
+              <w:t>C 需求与质量负责人</w:t>
             </w:r>
           </w:p>
         </w:tc>
@@ -1430,7 +1158,7 @@
                 <w:b w:val="0"/>
                 <w:sz w:val="17"/>
               </w:rPr>
-              <w:t>可能，存在未决条件或历史先例</w:t>
+              <w:t>提供合规、追踪、关键数字与验收风险输入</w:t>
             </w:r>
           </w:p>
         </w:tc>
@@ -1451,7 +1179,7 @@
                 <w:b w:val="0"/>
                 <w:sz w:val="17"/>
               </w:rPr>
-              <w:t>影响单一交付件、测试批次或一般里程碑</w:t>
+              <w:t>不承担本文件 Review</w:t>
             </w:r>
           </w:p>
         </w:tc>
@@ -1474,7 +1202,7 @@
                 <w:b w:val="0"/>
                 <w:sz w:val="17"/>
               </w:rPr>
-              <w:t>4</w:t>
+              <w:t>风险责任人</w:t>
             </w:r>
           </w:p>
         </w:tc>
@@ -1495,7 +1223,7 @@
                 <w:b w:val="0"/>
                 <w:sz w:val="17"/>
               </w:rPr>
-              <w:t>较高，已有明确缺口或触发征兆</w:t>
+              <w:t>监测触发器、执行预防/缓解、提交证据与关闭建议</w:t>
             </w:r>
           </w:p>
         </w:tc>
@@ -1516,72 +1244,7 @@
                 <w:b w:val="0"/>
                 <w:sz w:val="17"/>
               </w:rPr>
-              <w:t>影响关键路径、★验收、外部联调或发布门禁</w:t>
-            </w:r>
-          </w:p>
-        </w:tc>
-      </w:tr>
-      <w:tr>
-        <w:tc>
-          <w:tcPr>
-            <w:tcW w:type="dxa" w:w="1512"/>
-            <w:vAlign w:val="center"/>
-          </w:tcPr>
-          <w:p>
-            <w:pPr>
-              <w:spacing w:after="0" w:line="240" w:lineRule="auto"/>
-              <w:jc w:val="left"/>
-            </w:pPr>
-            <w:r/>
-            <w:r>
-              <w:rPr>
-                <w:rFonts w:ascii="Times New Roman" w:hAnsi="Times New Roman" w:eastAsia="宋体"/>
-                <w:b w:val="0"/>
-                <w:sz w:val="17"/>
-              </w:rPr>
-              <w:t>5</w:t>
-            </w:r>
-          </w:p>
-        </w:tc>
-        <w:tc>
-          <w:tcPr>
-            <w:tcW w:type="dxa" w:w="3024"/>
-            <w:vAlign w:val="center"/>
-          </w:tcPr>
-          <w:p>
-            <w:pPr>
-              <w:spacing w:after="0" w:line="240" w:lineRule="auto"/>
-              <w:jc w:val="left"/>
-            </w:pPr>
-            <w:r/>
-            <w:r>
-              <w:rPr>
-                <w:rFonts w:ascii="Times New Roman" w:hAnsi="Times New Roman" w:eastAsia="宋体"/>
-                <w:b w:val="0"/>
-                <w:sz w:val="17"/>
-              </w:rPr>
-              <w:t>几乎确定或已接近触发</w:t>
-            </w:r>
-          </w:p>
-        </w:tc>
-        <w:tc>
-          <w:tcPr>
-            <w:tcW w:type="dxa" w:w="4536"/>
-            <w:vAlign w:val="center"/>
-          </w:tcPr>
-          <w:p>
-            <w:pPr>
-              <w:spacing w:after="0" w:line="240" w:lineRule="auto"/>
-              <w:jc w:val="left"/>
-            </w:pPr>
-            <w:r/>
-            <w:r>
-              <w:rPr>
-                <w:rFonts w:ascii="Times New Roman" w:hAnsi="Times New Roman" w:eastAsia="宋体"/>
-                <w:b w:val="0"/>
-                <w:sz w:val="17"/>
-              </w:rPr>
-              <w:t>导致基线不可冻结、验收失败、严重安全/业务中断</w:t>
+              <w:t>一项风险只指定一名牵头角色，可协同但不可转移责任</w:t>
             </w:r>
           </w:p>
         </w:tc>
@@ -1598,7 +1261,7 @@
           <w:rFonts w:ascii="Times New Roman" w:hAnsi="Times New Roman" w:eastAsia="宋体"/>
           <w:sz w:val="21"/>
         </w:rPr>
-        <w:t>风险值为 P×I：1—4 低、5—9 中、10—16 高、17—25 极高。同等级按★/安全/基线门禁、触发临近度、依赖范围排序；Issue 已 OPEN 的相关风险不得因“已知”而降低等级。</w:t>
+        <w:t>风险是可能发生的不确定事件；Issue 是已经发生且需跟踪的问题；缺陷进入缺陷流程；改变基线、范围、接口或指标的处置进入 CR/CCB。风险触发后不得只改风险状态：已成事实则创建或关联 Issue，需改基线则提交 CR，发布阻断按质量与配置门禁处理。</w:t>
       </w:r>
     </w:p>
     <w:p>
@@ -1611,7 +1274,496 @@
           <w:rFonts w:ascii="Times New Roman" w:hAnsi="Times New Roman" w:eastAsia="黑体"/>
           <w:b/>
         </w:rPr>
+        <w:t>3.1 识别与分类</w:t>
+      </w:r>
+    </w:p>
+    <w:p>
+      <w:pPr>
+        <w:spacing w:after="100" w:line="300" w:lineRule="auto"/>
+        <w:ind w:firstLine="480"/>
+        <w:jc w:val="both"/>
+      </w:pPr>
+      <w:r>
+        <w:rPr>
+          <w:rFonts w:ascii="Times New Roman" w:hAnsi="Times New Roman" w:eastAsia="宋体"/>
+          <w:sz w:val="21"/>
+        </w:rPr>
+        <w:t>每周例会、里程碑评审、需求/设计/测试 Review、接口联调、监控告警、缺陷趋势、变更影响和复盘均可提出风险。风险陈述至少包含原因、可能事件、影响；分类采用范围/需求、外部依赖、技术/接口、数据、NFR/安全、进度/资源、质量/配置、运维/发布。</w:t>
+      </w:r>
+    </w:p>
+    <w:p>
+      <w:pPr>
+        <w:pStyle w:val="1"/>
+        <w:keepNext/>
+      </w:pPr>
+      <w:r>
+        <w:rPr>
+          <w:rFonts w:ascii="Times New Roman" w:hAnsi="Times New Roman" w:eastAsia="黑体"/>
+          <w:b/>
+        </w:rPr>
+        <w:t>3.2 概率与影响</w:t>
+      </w:r>
+    </w:p>
+    <w:p>
+      <w:pPr>
+        <w:keepNext/>
+        <w:spacing w:before="80" w:after="60"/>
+        <w:jc w:val="center"/>
+      </w:pPr>
+      <w:r>
+        <w:rPr>
+          <w:rFonts w:ascii="Times New Roman" w:hAnsi="Times New Roman" w:eastAsia="黑体"/>
+          <w:b/>
+          <w:sz w:val="18"/>
+        </w:rPr>
+        <w:t>表 3-1 风险概率与影响评分定义</w:t>
+      </w:r>
+    </w:p>
+    <w:tbl>
+      <w:tblPr>
+        <w:tblW w:type="auto" w:w="0"/>
+        <w:tblLayout w:type="fixed"/>
+        <w:tblLook w:firstColumn="1" w:firstRow="1" w:lastColumn="0" w:lastRow="0" w:noHBand="0" w:noVBand="1" w:val="04A0"/>
+      </w:tblPr>
+      <w:tblGrid>
+        <w:gridCol w:w="1512"/>
+        <w:gridCol w:w="3024"/>
+        <w:gridCol w:w="4536"/>
+      </w:tblGrid>
+      <w:tr>
+        <w:trPr>
+          <w:tblHeader w:val="true"/>
+        </w:trPr>
+        <w:tc>
+          <w:tcPr>
+            <w:tcW w:type="dxa" w:w="1512"/>
+            <w:vAlign w:val="center"/>
+          </w:tcPr>
+          <w:p>
+            <w:pPr>
+              <w:spacing w:after="0" w:line="240" w:lineRule="auto"/>
+              <w:jc w:val="left"/>
+            </w:pPr>
+            <w:r/>
+            <w:r>
+              <w:rPr>
+                <w:rFonts w:ascii="Times New Roman" w:hAnsi="Times New Roman" w:eastAsia="宋体"/>
+                <w:b/>
+                <w:sz w:val="17"/>
+              </w:rPr>
+              <w:t>分值</w:t>
+            </w:r>
+          </w:p>
+        </w:tc>
+        <w:tc>
+          <w:tcPr>
+            <w:tcW w:type="dxa" w:w="3024"/>
+            <w:vAlign w:val="center"/>
+          </w:tcPr>
+          <w:p>
+            <w:pPr>
+              <w:spacing w:after="0" w:line="240" w:lineRule="auto"/>
+              <w:jc w:val="left"/>
+            </w:pPr>
+            <w:r/>
+            <w:r>
+              <w:rPr>
+                <w:rFonts w:ascii="Times New Roman" w:hAnsi="Times New Roman" w:eastAsia="宋体"/>
+                <w:b/>
+                <w:sz w:val="17"/>
+              </w:rPr>
+              <w:t>概率判定</w:t>
+            </w:r>
+          </w:p>
+        </w:tc>
+        <w:tc>
+          <w:tcPr>
+            <w:tcW w:type="dxa" w:w="4536"/>
+            <w:vAlign w:val="center"/>
+          </w:tcPr>
+          <w:p>
+            <w:pPr>
+              <w:spacing w:after="0" w:line="240" w:lineRule="auto"/>
+              <w:jc w:val="left"/>
+            </w:pPr>
+            <w:r/>
+            <w:r>
+              <w:rPr>
+                <w:rFonts w:ascii="Times New Roman" w:hAnsi="Times New Roman" w:eastAsia="宋体"/>
+                <w:b/>
+                <w:sz w:val="17"/>
+              </w:rPr>
+              <w:t>影响判定</w:t>
+            </w:r>
+          </w:p>
+        </w:tc>
+      </w:tr>
+      <w:tr>
+        <w:tc>
+          <w:tcPr>
+            <w:tcW w:type="dxa" w:w="1512"/>
+            <w:vAlign w:val="center"/>
+          </w:tcPr>
+          <w:p>
+            <w:pPr>
+              <w:spacing w:after="0" w:line="240" w:lineRule="auto"/>
+              <w:jc w:val="left"/>
+            </w:pPr>
+            <w:r/>
+            <w:r>
+              <w:rPr>
+                <w:rFonts w:ascii="Times New Roman" w:hAnsi="Times New Roman" w:eastAsia="宋体"/>
+                <w:b w:val="0"/>
+                <w:sz w:val="17"/>
+              </w:rPr>
+              <w:t>1</w:t>
+            </w:r>
+          </w:p>
+        </w:tc>
+        <w:tc>
+          <w:tcPr>
+            <w:tcW w:type="dxa" w:w="3024"/>
+            <w:vAlign w:val="center"/>
+          </w:tcPr>
+          <w:p>
+            <w:pPr>
+              <w:spacing w:after="0" w:line="240" w:lineRule="auto"/>
+              <w:jc w:val="left"/>
+            </w:pPr>
+            <w:r/>
+            <w:r>
+              <w:rPr>
+                <w:rFonts w:ascii="Times New Roman" w:hAnsi="Times New Roman" w:eastAsia="宋体"/>
+                <w:b w:val="0"/>
+                <w:sz w:val="17"/>
+              </w:rPr>
+              <w:t>极少，当前无迹象</w:t>
+            </w:r>
+          </w:p>
+        </w:tc>
+        <w:tc>
+          <w:tcPr>
+            <w:tcW w:type="dxa" w:w="4536"/>
+            <w:vAlign w:val="center"/>
+          </w:tcPr>
+          <w:p>
+            <w:pPr>
+              <w:spacing w:after="0" w:line="240" w:lineRule="auto"/>
+              <w:jc w:val="left"/>
+            </w:pPr>
+            <w:r/>
+            <w:r>
+              <w:rPr>
+                <w:rFonts w:ascii="Times New Roman" w:hAnsi="Times New Roman" w:eastAsia="宋体"/>
+                <w:b w:val="0"/>
+                <w:sz w:val="17"/>
+              </w:rPr>
+              <w:t>可在责任人日常工作内吸收，不影响门禁</w:t>
+            </w:r>
+          </w:p>
+        </w:tc>
+      </w:tr>
+      <w:tr>
+        <w:tc>
+          <w:tcPr>
+            <w:tcW w:type="dxa" w:w="1512"/>
+            <w:vAlign w:val="center"/>
+          </w:tcPr>
+          <w:p>
+            <w:pPr>
+              <w:spacing w:after="0" w:line="240" w:lineRule="auto"/>
+              <w:jc w:val="left"/>
+            </w:pPr>
+            <w:r/>
+            <w:r>
+              <w:rPr>
+                <w:rFonts w:ascii="Times New Roman" w:hAnsi="Times New Roman" w:eastAsia="宋体"/>
+                <w:b w:val="0"/>
+                <w:sz w:val="17"/>
+              </w:rPr>
+              <w:t>2</w:t>
+            </w:r>
+          </w:p>
+        </w:tc>
+        <w:tc>
+          <w:tcPr>
+            <w:tcW w:type="dxa" w:w="3024"/>
+            <w:vAlign w:val="center"/>
+          </w:tcPr>
+          <w:p>
+            <w:pPr>
+              <w:spacing w:after="0" w:line="240" w:lineRule="auto"/>
+              <w:jc w:val="left"/>
+            </w:pPr>
+            <w:r/>
+            <w:r>
+              <w:rPr>
+                <w:rFonts w:ascii="Times New Roman" w:hAnsi="Times New Roman" w:eastAsia="宋体"/>
+                <w:b w:val="0"/>
+                <w:sz w:val="17"/>
+              </w:rPr>
+              <w:t>较低，有替代方案且依赖稳定</w:t>
+            </w:r>
+          </w:p>
+        </w:tc>
+        <w:tc>
+          <w:tcPr>
+            <w:tcW w:type="dxa" w:w="4536"/>
+            <w:vAlign w:val="center"/>
+          </w:tcPr>
+          <w:p>
+            <w:pPr>
+              <w:spacing w:after="0" w:line="240" w:lineRule="auto"/>
+              <w:jc w:val="left"/>
+            </w:pPr>
+            <w:r/>
+            <w:r>
+              <w:rPr>
+                <w:rFonts w:ascii="Times New Roman" w:hAnsi="Times New Roman" w:eastAsia="宋体"/>
+                <w:b w:val="0"/>
+                <w:sz w:val="17"/>
+              </w:rPr>
+              <w:t>小范围返工，不改变关键路径</w:t>
+            </w:r>
+          </w:p>
+        </w:tc>
+      </w:tr>
+      <w:tr>
+        <w:tc>
+          <w:tcPr>
+            <w:tcW w:type="dxa" w:w="1512"/>
+            <w:vAlign w:val="center"/>
+          </w:tcPr>
+          <w:p>
+            <w:pPr>
+              <w:spacing w:after="0" w:line="240" w:lineRule="auto"/>
+              <w:jc w:val="left"/>
+            </w:pPr>
+            <w:r/>
+            <w:r>
+              <w:rPr>
+                <w:rFonts w:ascii="Times New Roman" w:hAnsi="Times New Roman" w:eastAsia="宋体"/>
+                <w:b w:val="0"/>
+                <w:sz w:val="17"/>
+              </w:rPr>
+              <w:t>3</w:t>
+            </w:r>
+          </w:p>
+        </w:tc>
+        <w:tc>
+          <w:tcPr>
+            <w:tcW w:type="dxa" w:w="3024"/>
+            <w:vAlign w:val="center"/>
+          </w:tcPr>
+          <w:p>
+            <w:pPr>
+              <w:spacing w:after="0" w:line="240" w:lineRule="auto"/>
+              <w:jc w:val="left"/>
+            </w:pPr>
+            <w:r/>
+            <w:r>
+              <w:rPr>
+                <w:rFonts w:ascii="Times New Roman" w:hAnsi="Times New Roman" w:eastAsia="宋体"/>
+                <w:b w:val="0"/>
+                <w:sz w:val="17"/>
+              </w:rPr>
+              <w:t>可能，存在未决条件或历史先例</w:t>
+            </w:r>
+          </w:p>
+        </w:tc>
+        <w:tc>
+          <w:tcPr>
+            <w:tcW w:type="dxa" w:w="4536"/>
+            <w:vAlign w:val="center"/>
+          </w:tcPr>
+          <w:p>
+            <w:pPr>
+              <w:spacing w:after="0" w:line="240" w:lineRule="auto"/>
+              <w:jc w:val="left"/>
+            </w:pPr>
+            <w:r/>
+            <w:r>
+              <w:rPr>
+                <w:rFonts w:ascii="Times New Roman" w:hAnsi="Times New Roman" w:eastAsia="宋体"/>
+                <w:b w:val="0"/>
+                <w:sz w:val="17"/>
+              </w:rPr>
+              <w:t>影响单一交付件、测试批次或一般里程碑</w:t>
+            </w:r>
+          </w:p>
+        </w:tc>
+      </w:tr>
+      <w:tr>
+        <w:tc>
+          <w:tcPr>
+            <w:tcW w:type="dxa" w:w="1512"/>
+            <w:vAlign w:val="center"/>
+          </w:tcPr>
+          <w:p>
+            <w:pPr>
+              <w:spacing w:after="0" w:line="240" w:lineRule="auto"/>
+              <w:jc w:val="left"/>
+            </w:pPr>
+            <w:r/>
+            <w:r>
+              <w:rPr>
+                <w:rFonts w:ascii="Times New Roman" w:hAnsi="Times New Roman" w:eastAsia="宋体"/>
+                <w:b w:val="0"/>
+                <w:sz w:val="17"/>
+              </w:rPr>
+              <w:t>4</w:t>
+            </w:r>
+          </w:p>
+        </w:tc>
+        <w:tc>
+          <w:tcPr>
+            <w:tcW w:type="dxa" w:w="3024"/>
+            <w:vAlign w:val="center"/>
+          </w:tcPr>
+          <w:p>
+            <w:pPr>
+              <w:spacing w:after="0" w:line="240" w:lineRule="auto"/>
+              <w:jc w:val="left"/>
+            </w:pPr>
+            <w:r/>
+            <w:r>
+              <w:rPr>
+                <w:rFonts w:ascii="Times New Roman" w:hAnsi="Times New Roman" w:eastAsia="宋体"/>
+                <w:b w:val="0"/>
+                <w:sz w:val="17"/>
+              </w:rPr>
+              <w:t>较高，已有明确缺口或触发征兆</w:t>
+            </w:r>
+          </w:p>
+        </w:tc>
+        <w:tc>
+          <w:tcPr>
+            <w:tcW w:type="dxa" w:w="4536"/>
+            <w:vAlign w:val="center"/>
+          </w:tcPr>
+          <w:p>
+            <w:pPr>
+              <w:spacing w:after="0" w:line="240" w:lineRule="auto"/>
+              <w:jc w:val="left"/>
+            </w:pPr>
+            <w:r/>
+            <w:r>
+              <w:rPr>
+                <w:rFonts w:ascii="Times New Roman" w:hAnsi="Times New Roman" w:eastAsia="宋体"/>
+                <w:b w:val="0"/>
+                <w:sz w:val="17"/>
+              </w:rPr>
+              <w:t>影响关键路径、★验收、外部联调或发布门禁</w:t>
+            </w:r>
+          </w:p>
+        </w:tc>
+      </w:tr>
+      <w:tr>
+        <w:tc>
+          <w:tcPr>
+            <w:tcW w:type="dxa" w:w="1512"/>
+            <w:vAlign w:val="center"/>
+          </w:tcPr>
+          <w:p>
+            <w:pPr>
+              <w:spacing w:after="0" w:line="240" w:lineRule="auto"/>
+              <w:jc w:val="left"/>
+            </w:pPr>
+            <w:r/>
+            <w:r>
+              <w:rPr>
+                <w:rFonts w:ascii="Times New Roman" w:hAnsi="Times New Roman" w:eastAsia="宋体"/>
+                <w:b w:val="0"/>
+                <w:sz w:val="17"/>
+              </w:rPr>
+              <w:t>5</w:t>
+            </w:r>
+          </w:p>
+        </w:tc>
+        <w:tc>
+          <w:tcPr>
+            <w:tcW w:type="dxa" w:w="3024"/>
+            <w:vAlign w:val="center"/>
+          </w:tcPr>
+          <w:p>
+            <w:pPr>
+              <w:spacing w:after="0" w:line="240" w:lineRule="auto"/>
+              <w:jc w:val="left"/>
+            </w:pPr>
+            <w:r/>
+            <w:r>
+              <w:rPr>
+                <w:rFonts w:ascii="Times New Roman" w:hAnsi="Times New Roman" w:eastAsia="宋体"/>
+                <w:b w:val="0"/>
+                <w:sz w:val="17"/>
+              </w:rPr>
+              <w:t>几乎确定或已接近触发</w:t>
+            </w:r>
+          </w:p>
+        </w:tc>
+        <w:tc>
+          <w:tcPr>
+            <w:tcW w:type="dxa" w:w="4536"/>
+            <w:vAlign w:val="center"/>
+          </w:tcPr>
+          <w:p>
+            <w:pPr>
+              <w:spacing w:after="0" w:line="240" w:lineRule="auto"/>
+              <w:jc w:val="left"/>
+            </w:pPr>
+            <w:r/>
+            <w:r>
+              <w:rPr>
+                <w:rFonts w:ascii="Times New Roman" w:hAnsi="Times New Roman" w:eastAsia="宋体"/>
+                <w:b w:val="0"/>
+                <w:sz w:val="17"/>
+              </w:rPr>
+              <w:t>导致基线不可冻结、验收失败、严重安全/业务中断</w:t>
+            </w:r>
+          </w:p>
+        </w:tc>
+      </w:tr>
+    </w:tbl>
+    <w:p>
+      <w:pPr>
+        <w:spacing w:after="100" w:line="300" w:lineRule="auto"/>
+        <w:ind w:firstLine="480"/>
+        <w:jc w:val="both"/>
+      </w:pPr>
+      <w:r>
+        <w:rPr>
+          <w:rFonts w:ascii="Times New Roman" w:hAnsi="Times New Roman" w:eastAsia="宋体"/>
+          <w:sz w:val="21"/>
+        </w:rPr>
+        <w:t>风险值为 P×I：1—4 低、5—9 中、10—16 高、17—25 极高。同等级按★/安全/基线门禁、触发临近度、依赖范围排序；Issue 已 OPEN 的相关风险不得因“已知”而降低等级。</w:t>
+      </w:r>
+    </w:p>
+    <w:p>
+      <w:pPr>
+        <w:pStyle w:val="1"/>
+        <w:keepNext/>
+      </w:pPr>
+      <w:r>
+        <w:rPr>
+          <w:rFonts w:ascii="Times New Roman" w:hAnsi="Times New Roman" w:eastAsia="黑体"/>
+          <w:b/>
+        </w:rPr>
         <w:t>4.1 当前极高与高风险</w:t>
+      </w:r>
+    </w:p>
+    <w:p>
+      <w:pPr>
+        <w:keepNext/>
+        <w:spacing w:before="80" w:after="60"/>
+        <w:jc w:val="center"/>
+      </w:pPr>
+      <w:r>
+        <w:rPr>
+          <w:rFonts w:ascii="Times New Roman" w:hAnsi="Times New Roman" w:eastAsia="黑体"/>
+          <w:b/>
+          <w:sz w:val="18"/>
+        </w:rPr>
+        <w:t>表 4-1 当前极高与高风险登记</w:t>
       </w:r>
     </w:p>
     <w:tbl>
@@ -2973,6 +3125,900 @@
           </w:p>
         </w:tc>
       </w:tr>
+      <w:tr>
+        <w:tc>
+          <w:tcPr>
+            <w:tcW w:type="dxa" w:w="1296"/>
+            <w:vAlign w:val="center"/>
+          </w:tcPr>
+          <w:p>
+            <w:pPr>
+              <w:spacing w:after="0" w:line="240" w:lineRule="auto"/>
+              <w:jc w:val="left"/>
+            </w:pPr>
+            <w:r/>
+            <w:r>
+              <w:rPr>
+                <w:rFonts w:ascii="Times New Roman" w:hAnsi="Times New Roman" w:eastAsia="宋体"/>
+                <w:b w:val="0"/>
+                <w:sz w:val="15"/>
+              </w:rPr>
+              <w:t>RR-03 数据/映射</w:t>
+            </w:r>
+          </w:p>
+        </w:tc>
+        <w:tc>
+          <w:tcPr>
+            <w:tcW w:type="dxa" w:w="1296"/>
+            <w:vAlign w:val="center"/>
+          </w:tcPr>
+          <w:p>
+            <w:pPr>
+              <w:spacing w:after="0" w:line="240" w:lineRule="auto"/>
+              <w:jc w:val="left"/>
+            </w:pPr>
+            <w:r/>
+            <w:r>
+              <w:rPr>
+                <w:rFonts w:ascii="Times New Roman" w:hAnsi="Times New Roman" w:eastAsia="宋体"/>
+                <w:b w:val="0"/>
+                <w:sz w:val="15"/>
+              </w:rPr>
+              <w:t>八类外部端口字段、枚举、时间与错误语义漂移，可能造成契约失败或错误归一化</w:t>
+            </w:r>
+          </w:p>
+        </w:tc>
+        <w:tc>
+          <w:tcPr>
+            <w:tcW w:type="dxa" w:w="1296"/>
+            <w:vAlign w:val="center"/>
+          </w:tcPr>
+          <w:p>
+            <w:pPr>
+              <w:spacing w:after="0" w:line="240" w:lineRule="auto"/>
+              <w:jc w:val="left"/>
+            </w:pPr>
+            <w:r/>
+            <w:r>
+              <w:rPr>
+                <w:rFonts w:ascii="Times New Roman" w:hAnsi="Times New Roman" w:eastAsia="宋体"/>
+                <w:b w:val="0"/>
+                <w:sz w:val="15"/>
+              </w:rPr>
+              <w:t>3/4/12 高</w:t>
+            </w:r>
+          </w:p>
+        </w:tc>
+        <w:tc>
+          <w:tcPr>
+            <w:tcW w:type="dxa" w:w="1296"/>
+            <w:vAlign w:val="center"/>
+          </w:tcPr>
+          <w:p>
+            <w:pPr>
+              <w:spacing w:after="0" w:line="240" w:lineRule="auto"/>
+              <w:jc w:val="left"/>
+            </w:pPr>
+            <w:r/>
+            <w:r>
+              <w:rPr>
+                <w:rFonts w:ascii="Times New Roman" w:hAnsi="Times New Roman" w:eastAsia="宋体"/>
+                <w:b w:val="0"/>
+                <w:sz w:val="15"/>
+              </w:rPr>
+              <w:t>映射失败、未知字段积压或破坏性变更</w:t>
+            </w:r>
+          </w:p>
+        </w:tc>
+        <w:tc>
+          <w:tcPr>
+            <w:tcW w:type="dxa" w:w="1296"/>
+            <w:vAlign w:val="center"/>
+          </w:tcPr>
+          <w:p>
+            <w:pPr>
+              <w:spacing w:after="0" w:line="240" w:lineRule="auto"/>
+              <w:jc w:val="left"/>
+            </w:pPr>
+            <w:r/>
+            <w:r>
+              <w:rPr>
+                <w:rFonts w:ascii="Times New Roman" w:hAnsi="Times New Roman" w:eastAsia="宋体"/>
+                <w:b w:val="0"/>
+                <w:sz w:val="15"/>
+              </w:rPr>
+              <w:t>版本化映射、未知字段隔离和契约差异门禁；失败时停用受影响映射并人工核对；破坏性变更升级 B/A 并按需提交 CR</w:t>
+            </w:r>
+          </w:p>
+        </w:tc>
+        <w:tc>
+          <w:tcPr>
+            <w:tcW w:type="dxa" w:w="1296"/>
+            <w:vAlign w:val="center"/>
+          </w:tcPr>
+          <w:p>
+            <w:pPr>
+              <w:spacing w:after="0" w:line="240" w:lineRule="auto"/>
+              <w:jc w:val="left"/>
+            </w:pPr>
+            <w:r/>
+            <w:r>
+              <w:rPr>
+                <w:rFonts w:ascii="Times New Roman" w:hAnsi="Times New Roman" w:eastAsia="宋体"/>
+                <w:b w:val="0"/>
+                <w:sz w:val="15"/>
+              </w:rPr>
+              <w:t>B</w:t>
+            </w:r>
+          </w:p>
+        </w:tc>
+        <w:tc>
+          <w:tcPr>
+            <w:tcW w:type="dxa" w:w="1296"/>
+            <w:vAlign w:val="center"/>
+          </w:tcPr>
+          <w:p>
+            <w:pPr>
+              <w:spacing w:after="0" w:line="240" w:lineRule="auto"/>
+              <w:jc w:val="left"/>
+            </w:pPr>
+            <w:r/>
+            <w:r>
+              <w:rPr>
+                <w:rFonts w:ascii="Times New Roman" w:hAnsi="Times New Roman" w:eastAsia="宋体"/>
+                <w:b w:val="0"/>
+                <w:sz w:val="15"/>
+              </w:rPr>
+              <w:t>每周；八端口契约及异常用例通过后关闭；OPEN</w:t>
+            </w:r>
+          </w:p>
+        </w:tc>
+      </w:tr>
+      <w:tr>
+        <w:tc>
+          <w:tcPr>
+            <w:tcW w:type="dxa" w:w="1296"/>
+            <w:vAlign w:val="center"/>
+          </w:tcPr>
+          <w:p>
+            <w:pPr>
+              <w:spacing w:after="0" w:line="240" w:lineRule="auto"/>
+              <w:jc w:val="left"/>
+            </w:pPr>
+            <w:r/>
+            <w:r>
+              <w:rPr>
+                <w:rFonts w:ascii="Times New Roman" w:hAnsi="Times New Roman" w:eastAsia="宋体"/>
+                <w:b w:val="0"/>
+                <w:sz w:val="15"/>
+              </w:rPr>
+              <w:t>RR-06 地图/定位</w:t>
+            </w:r>
+          </w:p>
+        </w:tc>
+        <w:tc>
+          <w:tcPr>
+            <w:tcW w:type="dxa" w:w="1296"/>
+            <w:vAlign w:val="center"/>
+          </w:tcPr>
+          <w:p>
+            <w:pPr>
+              <w:spacing w:after="0" w:line="240" w:lineRule="auto"/>
+              <w:jc w:val="left"/>
+            </w:pPr>
+            <w:r/>
+            <w:r>
+              <w:rPr>
+                <w:rFonts w:ascii="Times New Roman" w:hAnsi="Times New Roman" w:eastAsia="宋体"/>
+                <w:b w:val="0"/>
+                <w:sz w:val="15"/>
+              </w:rPr>
+              <w:t>坐标系、楼层、精度或新鲜度未确认，可能导致错误展示或调度</w:t>
+            </w:r>
+          </w:p>
+        </w:tc>
+        <w:tc>
+          <w:tcPr>
+            <w:tcW w:type="dxa" w:w="1296"/>
+            <w:vAlign w:val="center"/>
+          </w:tcPr>
+          <w:p>
+            <w:pPr>
+              <w:spacing w:after="0" w:line="240" w:lineRule="auto"/>
+              <w:jc w:val="left"/>
+            </w:pPr>
+            <w:r/>
+            <w:r>
+              <w:rPr>
+                <w:rFonts w:ascii="Times New Roman" w:hAnsi="Times New Roman" w:eastAsia="宋体"/>
+                <w:b w:val="0"/>
+                <w:sz w:val="15"/>
+              </w:rPr>
+              <w:t>3/4/12 高</w:t>
+            </w:r>
+          </w:p>
+        </w:tc>
+        <w:tc>
+          <w:tcPr>
+            <w:tcW w:type="dxa" w:w="1296"/>
+            <w:vAlign w:val="center"/>
+          </w:tcPr>
+          <w:p>
+            <w:pPr>
+              <w:spacing w:after="0" w:line="240" w:lineRule="auto"/>
+              <w:jc w:val="left"/>
+            </w:pPr>
+            <w:r/>
+            <w:r>
+              <w:rPr>
+                <w:rFonts w:ascii="Times New Roman" w:hAnsi="Times New Roman" w:eastAsia="宋体"/>
+                <w:b w:val="0"/>
+                <w:sz w:val="15"/>
+              </w:rPr>
+              <w:t>位置偏移、数据过期仍参与调派或楼层映射失败</w:t>
+            </w:r>
+          </w:p>
+        </w:tc>
+        <w:tc>
+          <w:tcPr>
+            <w:tcW w:type="dxa" w:w="1296"/>
+            <w:vAlign w:val="center"/>
+          </w:tcPr>
+          <w:p>
+            <w:pPr>
+              <w:spacing w:after="0" w:line="240" w:lineRule="auto"/>
+              <w:jc w:val="left"/>
+            </w:pPr>
+            <w:r/>
+            <w:r>
+              <w:rPr>
+                <w:rFonts w:ascii="Times New Roman" w:hAnsi="Times New Roman" w:eastAsia="宋体"/>
+                <w:b w:val="0"/>
+                <w:sz w:val="15"/>
+              </w:rPr>
+              <w:t>保存源精度与时间，过期位置降级；异常时停止自动调派并人工确认；跨系统语义不一致升级 B</w:t>
+            </w:r>
+          </w:p>
+        </w:tc>
+        <w:tc>
+          <w:tcPr>
+            <w:tcW w:type="dxa" w:w="1296"/>
+            <w:vAlign w:val="center"/>
+          </w:tcPr>
+          <w:p>
+            <w:pPr>
+              <w:spacing w:after="0" w:line="240" w:lineRule="auto"/>
+              <w:jc w:val="left"/>
+            </w:pPr>
+            <w:r/>
+            <w:r>
+              <w:rPr>
+                <w:rFonts w:ascii="Times New Roman" w:hAnsi="Times New Roman" w:eastAsia="宋体"/>
+                <w:b w:val="0"/>
+                <w:sz w:val="15"/>
+              </w:rPr>
+              <w:t>B</w:t>
+            </w:r>
+          </w:p>
+        </w:tc>
+        <w:tc>
+          <w:tcPr>
+            <w:tcW w:type="dxa" w:w="1296"/>
+            <w:vAlign w:val="center"/>
+          </w:tcPr>
+          <w:p>
+            <w:pPr>
+              <w:spacing w:after="0" w:line="240" w:lineRule="auto"/>
+              <w:jc w:val="left"/>
+            </w:pPr>
+            <w:r/>
+            <w:r>
+              <w:rPr>
+                <w:rFonts w:ascii="Times New Roman" w:hAnsi="Times New Roman" w:eastAsia="宋体"/>
+                <w:b w:val="0"/>
+                <w:sz w:val="15"/>
+              </w:rPr>
+              <w:t>每周；源与展示比对及过期降级用例通过后关闭；OPEN</w:t>
+            </w:r>
+          </w:p>
+        </w:tc>
+      </w:tr>
+      <w:tr>
+        <w:tc>
+          <w:tcPr>
+            <w:tcW w:type="dxa" w:w="1296"/>
+            <w:vAlign w:val="center"/>
+          </w:tcPr>
+          <w:p>
+            <w:pPr>
+              <w:spacing w:after="0" w:line="240" w:lineRule="auto"/>
+              <w:jc w:val="left"/>
+            </w:pPr>
+            <w:r/>
+            <w:r>
+              <w:rPr>
+                <w:rFonts w:ascii="Times New Roman" w:hAnsi="Times New Roman" w:eastAsia="宋体"/>
+                <w:b w:val="0"/>
+                <w:sz w:val="15"/>
+              </w:rPr>
+              <w:t>RR-07 数据质量</w:t>
+            </w:r>
+          </w:p>
+        </w:tc>
+        <w:tc>
+          <w:tcPr>
+            <w:tcW w:type="dxa" w:w="1296"/>
+            <w:vAlign w:val="center"/>
+          </w:tcPr>
+          <w:p>
+            <w:pPr>
+              <w:spacing w:after="0" w:line="240" w:lineRule="auto"/>
+              <w:jc w:val="left"/>
+            </w:pPr>
+            <w:r/>
+            <w:r>
+              <w:rPr>
+                <w:rFonts w:ascii="Times New Roman" w:hAnsi="Times New Roman" w:eastAsia="宋体"/>
+                <w:b w:val="0"/>
+                <w:sz w:val="15"/>
+              </w:rPr>
+              <w:t>组织、人员、点位、物资等源数据不完整或重复，可能影响调度和统计</w:t>
+            </w:r>
+          </w:p>
+        </w:tc>
+        <w:tc>
+          <w:tcPr>
+            <w:tcW w:type="dxa" w:w="1296"/>
+            <w:vAlign w:val="center"/>
+          </w:tcPr>
+          <w:p>
+            <w:pPr>
+              <w:spacing w:after="0" w:line="240" w:lineRule="auto"/>
+              <w:jc w:val="left"/>
+            </w:pPr>
+            <w:r/>
+            <w:r>
+              <w:rPr>
+                <w:rFonts w:ascii="Times New Roman" w:hAnsi="Times New Roman" w:eastAsia="宋体"/>
+                <w:b w:val="0"/>
+                <w:sz w:val="15"/>
+              </w:rPr>
+              <w:t>3/4/12 高</w:t>
+            </w:r>
+          </w:p>
+        </w:tc>
+        <w:tc>
+          <w:tcPr>
+            <w:tcW w:type="dxa" w:w="1296"/>
+            <w:vAlign w:val="center"/>
+          </w:tcPr>
+          <w:p>
+            <w:pPr>
+              <w:spacing w:after="0" w:line="240" w:lineRule="auto"/>
+              <w:jc w:val="left"/>
+            </w:pPr>
+            <w:r/>
+            <w:r>
+              <w:rPr>
+                <w:rFonts w:ascii="Times New Roman" w:hAnsi="Times New Roman" w:eastAsia="宋体"/>
+                <w:b w:val="0"/>
+                <w:sz w:val="15"/>
+              </w:rPr>
+              <w:t>完整率、唯一性、引用或对账检查失败</w:t>
+            </w:r>
+          </w:p>
+        </w:tc>
+        <w:tc>
+          <w:tcPr>
+            <w:tcW w:type="dxa" w:w="1296"/>
+            <w:vAlign w:val="center"/>
+          </w:tcPr>
+          <w:p>
+            <w:pPr>
+              <w:spacing w:after="0" w:line="240" w:lineRule="auto"/>
+              <w:jc w:val="left"/>
+            </w:pPr>
+            <w:r/>
+            <w:r>
+              <w:rPr>
+                <w:rFonts w:ascii="Times New Roman" w:hAnsi="Times New Roman" w:eastAsia="宋体"/>
+                <w:b w:val="0"/>
+                <w:sz w:val="15"/>
+              </w:rPr>
+              <w:t>导入校验、主键/引用检查和异常清单；失败批次隔离并人工修正；持续失败升级 C/A</w:t>
+            </w:r>
+          </w:p>
+        </w:tc>
+        <w:tc>
+          <w:tcPr>
+            <w:tcW w:type="dxa" w:w="1296"/>
+            <w:vAlign w:val="center"/>
+          </w:tcPr>
+          <w:p>
+            <w:pPr>
+              <w:spacing w:after="0" w:line="240" w:lineRule="auto"/>
+              <w:jc w:val="left"/>
+            </w:pPr>
+            <w:r/>
+            <w:r>
+              <w:rPr>
+                <w:rFonts w:ascii="Times New Roman" w:hAnsi="Times New Roman" w:eastAsia="宋体"/>
+                <w:b w:val="0"/>
+                <w:sz w:val="15"/>
+              </w:rPr>
+              <w:t>C</w:t>
+            </w:r>
+          </w:p>
+        </w:tc>
+        <w:tc>
+          <w:tcPr>
+            <w:tcW w:type="dxa" w:w="1296"/>
+            <w:vAlign w:val="center"/>
+          </w:tcPr>
+          <w:p>
+            <w:pPr>
+              <w:spacing w:after="0" w:line="240" w:lineRule="auto"/>
+              <w:jc w:val="left"/>
+            </w:pPr>
+            <w:r/>
+            <w:r>
+              <w:rPr>
+                <w:rFonts w:ascii="Times New Roman" w:hAnsi="Times New Roman" w:eastAsia="宋体"/>
+                <w:b w:val="0"/>
+                <w:sz w:val="15"/>
+              </w:rPr>
+              <w:t>每周；受控样本导入与对账通过后关闭；OPEN</w:t>
+            </w:r>
+          </w:p>
+        </w:tc>
+      </w:tr>
+      <w:tr>
+        <w:tc>
+          <w:tcPr>
+            <w:tcW w:type="dxa" w:w="1296"/>
+            <w:vAlign w:val="center"/>
+          </w:tcPr>
+          <w:p>
+            <w:pPr>
+              <w:spacing w:after="0" w:line="240" w:lineRule="auto"/>
+              <w:jc w:val="left"/>
+            </w:pPr>
+            <w:r/>
+            <w:r>
+              <w:rPr>
+                <w:rFonts w:ascii="Times New Roman" w:hAnsi="Times New Roman" w:eastAsia="宋体"/>
+                <w:b w:val="0"/>
+                <w:sz w:val="15"/>
+              </w:rPr>
+              <w:t>RR-10 部署/恢复</w:t>
+            </w:r>
+          </w:p>
+        </w:tc>
+        <w:tc>
+          <w:tcPr>
+            <w:tcW w:type="dxa" w:w="1296"/>
+            <w:vAlign w:val="center"/>
+          </w:tcPr>
+          <w:p>
+            <w:pPr>
+              <w:spacing w:after="0" w:line="240" w:lineRule="auto"/>
+              <w:jc w:val="left"/>
+            </w:pPr>
+            <w:r/>
+            <w:r>
+              <w:rPr>
+                <w:rFonts w:ascii="Times New Roman" w:hAnsi="Times New Roman" w:eastAsia="宋体"/>
+                <w:b w:val="0"/>
+                <w:sz w:val="15"/>
+              </w:rPr>
+              <w:t>私有化资源、备份恢复或回滚未验证，可能延长中断或阻断发布</w:t>
+            </w:r>
+          </w:p>
+        </w:tc>
+        <w:tc>
+          <w:tcPr>
+            <w:tcW w:type="dxa" w:w="1296"/>
+            <w:vAlign w:val="center"/>
+          </w:tcPr>
+          <w:p>
+            <w:pPr>
+              <w:spacing w:after="0" w:line="240" w:lineRule="auto"/>
+              <w:jc w:val="left"/>
+            </w:pPr>
+            <w:r/>
+            <w:r>
+              <w:rPr>
+                <w:rFonts w:ascii="Times New Roman" w:hAnsi="Times New Roman" w:eastAsia="宋体"/>
+                <w:b w:val="0"/>
+                <w:sz w:val="15"/>
+              </w:rPr>
+              <w:t>3/4/12 高</w:t>
+            </w:r>
+          </w:p>
+        </w:tc>
+        <w:tc>
+          <w:tcPr>
+            <w:tcW w:type="dxa" w:w="1296"/>
+            <w:vAlign w:val="center"/>
+          </w:tcPr>
+          <w:p>
+            <w:pPr>
+              <w:spacing w:after="0" w:line="240" w:lineRule="auto"/>
+              <w:jc w:val="left"/>
+            </w:pPr>
+            <w:r/>
+            <w:r>
+              <w:rPr>
+                <w:rFonts w:ascii="Times New Roman" w:hAnsi="Times New Roman" w:eastAsia="宋体"/>
+                <w:b w:val="0"/>
+                <w:sz w:val="15"/>
+              </w:rPr>
+              <w:t>干净部署、备份校验、恢复或回滚演练失败</w:t>
+            </w:r>
+          </w:p>
+        </w:tc>
+        <w:tc>
+          <w:tcPr>
+            <w:tcW w:type="dxa" w:w="1296"/>
+            <w:vAlign w:val="center"/>
+          </w:tcPr>
+          <w:p>
+            <w:pPr>
+              <w:spacing w:after="0" w:line="240" w:lineRule="auto"/>
+              <w:jc w:val="left"/>
+            </w:pPr>
+            <w:r/>
+            <w:r>
+              <w:rPr>
+                <w:rFonts w:ascii="Times New Roman" w:hAnsi="Times New Roman" w:eastAsia="宋体"/>
+                <w:b w:val="0"/>
+                <w:sz w:val="15"/>
+              </w:rPr>
+              <w:t>外置配置、迁移/回滚脚本和恢复演练；失败时停止发布并恢复已知良好版本；升级 B/A</w:t>
+            </w:r>
+          </w:p>
+        </w:tc>
+        <w:tc>
+          <w:tcPr>
+            <w:tcW w:type="dxa" w:w="1296"/>
+            <w:vAlign w:val="center"/>
+          </w:tcPr>
+          <w:p>
+            <w:pPr>
+              <w:spacing w:after="0" w:line="240" w:lineRule="auto"/>
+              <w:jc w:val="left"/>
+            </w:pPr>
+            <w:r/>
+            <w:r>
+              <w:rPr>
+                <w:rFonts w:ascii="Times New Roman" w:hAnsi="Times New Roman" w:eastAsia="宋体"/>
+                <w:b w:val="0"/>
+                <w:sz w:val="15"/>
+              </w:rPr>
+              <w:t>B</w:t>
+            </w:r>
+          </w:p>
+        </w:tc>
+        <w:tc>
+          <w:tcPr>
+            <w:tcW w:type="dxa" w:w="1296"/>
+            <w:vAlign w:val="center"/>
+          </w:tcPr>
+          <w:p>
+            <w:pPr>
+              <w:spacing w:after="0" w:line="240" w:lineRule="auto"/>
+              <w:jc w:val="left"/>
+            </w:pPr>
+            <w:r/>
+            <w:r>
+              <w:rPr>
+                <w:rFonts w:ascii="Times New Roman" w:hAnsi="Times New Roman" w:eastAsia="宋体"/>
+                <w:b w:val="0"/>
+                <w:sz w:val="15"/>
+              </w:rPr>
+              <w:t>每周及每次演练；独立部署、回滚和恢复演练通过后关闭；OPEN</w:t>
+            </w:r>
+          </w:p>
+        </w:tc>
+      </w:tr>
+      <w:tr>
+        <w:tc>
+          <w:tcPr>
+            <w:tcW w:type="dxa" w:w="1296"/>
+            <w:vAlign w:val="center"/>
+          </w:tcPr>
+          <w:p>
+            <w:pPr>
+              <w:spacing w:after="0" w:line="240" w:lineRule="auto"/>
+              <w:jc w:val="left"/>
+            </w:pPr>
+            <w:r/>
+            <w:r>
+              <w:rPr>
+                <w:rFonts w:ascii="Times New Roman" w:hAnsi="Times New Roman" w:eastAsia="宋体"/>
+                <w:b w:val="0"/>
+                <w:sz w:val="15"/>
+              </w:rPr>
+              <w:t>RR-11 范围/变更</w:t>
+            </w:r>
+          </w:p>
+        </w:tc>
+        <w:tc>
+          <w:tcPr>
+            <w:tcW w:type="dxa" w:w="1296"/>
+            <w:vAlign w:val="center"/>
+          </w:tcPr>
+          <w:p>
+            <w:pPr>
+              <w:spacing w:after="0" w:line="240" w:lineRule="auto"/>
+              <w:jc w:val="left"/>
+            </w:pPr>
+            <w:r/>
+            <w:r>
+              <w:rPr>
+                <w:rFonts w:ascii="Times New Roman" w:hAnsi="Times New Roman" w:eastAsia="宋体"/>
+                <w:b w:val="0"/>
+                <w:sz w:val="15"/>
+              </w:rPr>
+              <w:t>未经评估的需求扩张可能冲击冻结范围、关键路径和验收</w:t>
+            </w:r>
+          </w:p>
+        </w:tc>
+        <w:tc>
+          <w:tcPr>
+            <w:tcW w:type="dxa" w:w="1296"/>
+            <w:vAlign w:val="center"/>
+          </w:tcPr>
+          <w:p>
+            <w:pPr>
+              <w:spacing w:after="0" w:line="240" w:lineRule="auto"/>
+              <w:jc w:val="left"/>
+            </w:pPr>
+            <w:r/>
+            <w:r>
+              <w:rPr>
+                <w:rFonts w:ascii="Times New Roman" w:hAnsi="Times New Roman" w:eastAsia="宋体"/>
+                <w:b w:val="0"/>
+                <w:sz w:val="15"/>
+              </w:rPr>
+              <w:t>3/4/12 高</w:t>
+            </w:r>
+          </w:p>
+        </w:tc>
+        <w:tc>
+          <w:tcPr>
+            <w:tcW w:type="dxa" w:w="1296"/>
+            <w:vAlign w:val="center"/>
+          </w:tcPr>
+          <w:p>
+            <w:pPr>
+              <w:spacing w:after="0" w:line="240" w:lineRule="auto"/>
+              <w:jc w:val="left"/>
+            </w:pPr>
+            <w:r/>
+            <w:r>
+              <w:rPr>
+                <w:rFonts w:ascii="Times New Roman" w:hAnsi="Times New Roman" w:eastAsia="宋体"/>
+                <w:b w:val="0"/>
+                <w:sz w:val="15"/>
+              </w:rPr>
+              <w:t>出现口头新增或拟改变 FR/AC/数字/责任</w:t>
+            </w:r>
+          </w:p>
+        </w:tc>
+        <w:tc>
+          <w:tcPr>
+            <w:tcW w:type="dxa" w:w="1296"/>
+            <w:vAlign w:val="center"/>
+          </w:tcPr>
+          <w:p>
+            <w:pPr>
+              <w:spacing w:after="0" w:line="240" w:lineRule="auto"/>
+              <w:jc w:val="left"/>
+            </w:pPr>
+            <w:r/>
+            <w:r>
+              <w:rPr>
+                <w:rFonts w:ascii="Times New Roman" w:hAnsi="Times New Roman" w:eastAsia="宋体"/>
+                <w:b w:val="0"/>
+                <w:sz w:val="15"/>
+              </w:rPr>
+              <w:t>所有变化进入 CR/CCB 和影响分析；未批准内容不实施；紧急事项先隔离并升级 A/CCB</w:t>
+            </w:r>
+          </w:p>
+        </w:tc>
+        <w:tc>
+          <w:tcPr>
+            <w:tcW w:type="dxa" w:w="1296"/>
+            <w:vAlign w:val="center"/>
+          </w:tcPr>
+          <w:p>
+            <w:pPr>
+              <w:spacing w:after="0" w:line="240" w:lineRule="auto"/>
+              <w:jc w:val="left"/>
+            </w:pPr>
+            <w:r/>
+            <w:r>
+              <w:rPr>
+                <w:rFonts w:ascii="Times New Roman" w:hAnsi="Times New Roman" w:eastAsia="宋体"/>
+                <w:b w:val="0"/>
+                <w:sz w:val="15"/>
+              </w:rPr>
+              <w:t>A</w:t>
+            </w:r>
+          </w:p>
+        </w:tc>
+        <w:tc>
+          <w:tcPr>
+            <w:tcW w:type="dxa" w:w="1296"/>
+            <w:vAlign w:val="center"/>
+          </w:tcPr>
+          <w:p>
+            <w:pPr>
+              <w:spacing w:after="0" w:line="240" w:lineRule="auto"/>
+              <w:jc w:val="left"/>
+            </w:pPr>
+            <w:r/>
+            <w:r>
+              <w:rPr>
+                <w:rFonts w:ascii="Times New Roman" w:hAnsi="Times New Roman" w:eastAsia="宋体"/>
+                <w:b w:val="0"/>
+                <w:sz w:val="15"/>
+              </w:rPr>
+              <w:t>每周；变更获批或拒绝并同步全部受控项后关闭；OPEN</w:t>
+            </w:r>
+          </w:p>
+        </w:tc>
+      </w:tr>
+      <w:tr>
+        <w:tc>
+          <w:tcPr>
+            <w:tcW w:type="dxa" w:w="1296"/>
+            <w:vAlign w:val="center"/>
+          </w:tcPr>
+          <w:p>
+            <w:pPr>
+              <w:spacing w:after="0" w:line="240" w:lineRule="auto"/>
+              <w:jc w:val="left"/>
+            </w:pPr>
+            <w:r/>
+            <w:r>
+              <w:rPr>
+                <w:rFonts w:ascii="Times New Roman" w:hAnsi="Times New Roman" w:eastAsia="宋体"/>
+                <w:b w:val="0"/>
+                <w:sz w:val="15"/>
+              </w:rPr>
+              <w:t>RR-15 AI/证据</w:t>
+            </w:r>
+          </w:p>
+        </w:tc>
+        <w:tc>
+          <w:tcPr>
+            <w:tcW w:type="dxa" w:w="1296"/>
+            <w:vAlign w:val="center"/>
+          </w:tcPr>
+          <w:p>
+            <w:pPr>
+              <w:spacing w:after="0" w:line="240" w:lineRule="auto"/>
+              <w:jc w:val="left"/>
+            </w:pPr>
+            <w:r/>
+            <w:r>
+              <w:rPr>
+                <w:rFonts w:ascii="Times New Roman" w:hAnsi="Times New Roman" w:eastAsia="宋体"/>
+                <w:b w:val="0"/>
+                <w:sz w:val="15"/>
+              </w:rPr>
+              <w:t>AI 生成内容可能引入未证实事实或把 Mock 写成实测，造成错误准出</w:t>
+            </w:r>
+          </w:p>
+        </w:tc>
+        <w:tc>
+          <w:tcPr>
+            <w:tcW w:type="dxa" w:w="1296"/>
+            <w:vAlign w:val="center"/>
+          </w:tcPr>
+          <w:p>
+            <w:pPr>
+              <w:spacing w:after="0" w:line="240" w:lineRule="auto"/>
+              <w:jc w:val="left"/>
+            </w:pPr>
+            <w:r/>
+            <w:r>
+              <w:rPr>
+                <w:rFonts w:ascii="Times New Roman" w:hAnsi="Times New Roman" w:eastAsia="宋体"/>
+                <w:b w:val="0"/>
+                <w:sz w:val="15"/>
+              </w:rPr>
+              <w:t>3/4/12 高</w:t>
+            </w:r>
+          </w:p>
+        </w:tc>
+        <w:tc>
+          <w:tcPr>
+            <w:tcW w:type="dxa" w:w="1296"/>
+            <w:vAlign w:val="center"/>
+          </w:tcPr>
+          <w:p>
+            <w:pPr>
+              <w:spacing w:after="0" w:line="240" w:lineRule="auto"/>
+              <w:jc w:val="left"/>
+            </w:pPr>
+            <w:r/>
+            <w:r>
+              <w:rPr>
+                <w:rFonts w:ascii="Times New Roman" w:hAnsi="Times New Roman" w:eastAsia="宋体"/>
+                <w:b w:val="0"/>
+                <w:sz w:val="15"/>
+              </w:rPr>
+              <w:t>无来源数字、虚构验证、日志缺失或结论与证据不一致</w:t>
+            </w:r>
+          </w:p>
+        </w:tc>
+        <w:tc>
+          <w:tcPr>
+            <w:tcW w:type="dxa" w:w="1296"/>
+            <w:vAlign w:val="center"/>
+          </w:tcPr>
+          <w:p>
+            <w:pPr>
+              <w:spacing w:after="0" w:line="240" w:lineRule="auto"/>
+              <w:jc w:val="left"/>
+            </w:pPr>
+            <w:r/>
+            <w:r>
+              <w:rPr>
+                <w:rFonts w:ascii="Times New Roman" w:hAnsi="Times New Roman" w:eastAsia="宋体"/>
+                <w:b w:val="0"/>
+                <w:sz w:val="15"/>
+              </w:rPr>
+              <w:t>来源优先级、Prompt/输出日志、机械检查与人工 Review；发现后撤回错误结论并重审；重大证据污染升级 C/A</w:t>
+            </w:r>
+          </w:p>
+        </w:tc>
+        <w:tc>
+          <w:tcPr>
+            <w:tcW w:type="dxa" w:w="1296"/>
+            <w:vAlign w:val="center"/>
+          </w:tcPr>
+          <w:p>
+            <w:pPr>
+              <w:spacing w:after="0" w:line="240" w:lineRule="auto"/>
+              <w:jc w:val="left"/>
+            </w:pPr>
+            <w:r/>
+            <w:r>
+              <w:rPr>
+                <w:rFonts w:ascii="Times New Roman" w:hAnsi="Times New Roman" w:eastAsia="宋体"/>
+                <w:b w:val="0"/>
+                <w:sz w:val="15"/>
+              </w:rPr>
+              <w:t>C</w:t>
+            </w:r>
+          </w:p>
+        </w:tc>
+        <w:tc>
+          <w:tcPr>
+            <w:tcW w:type="dxa" w:w="1296"/>
+            <w:vAlign w:val="center"/>
+          </w:tcPr>
+          <w:p>
+            <w:pPr>
+              <w:spacing w:after="0" w:line="240" w:lineRule="auto"/>
+              <w:jc w:val="left"/>
+            </w:pPr>
+            <w:r/>
+            <w:r>
+              <w:rPr>
+                <w:rFonts w:ascii="Times New Roman" w:hAnsi="Times New Roman" w:eastAsia="宋体"/>
+                <w:b w:val="0"/>
+                <w:sz w:val="15"/>
+              </w:rPr>
+              <w:t>每周；抽查无未证实结论且证据链完整后关闭；OPEN</w:t>
+            </w:r>
+          </w:p>
+        </w:tc>
+      </w:tr>
     </w:tbl>
     <w:p>
       <w:pPr>
@@ -2984,7 +4030,22 @@
           <w:rFonts w:ascii="Times New Roman" w:hAnsi="Times New Roman" w:eastAsia="黑体"/>
           <w:b/>
         </w:rPr>
-        <w:t>4.2 中低风险与持续监测</w:t>
+        <w:t>4.2 当前中风险与持续监测</w:t>
+      </w:r>
+    </w:p>
+    <w:p>
+      <w:pPr>
+        <w:keepNext/>
+        <w:spacing w:before="80" w:after="60"/>
+        <w:jc w:val="center"/>
+      </w:pPr>
+      <w:r>
+        <w:rPr>
+          <w:rFonts w:ascii="Times New Roman" w:hAnsi="Times New Roman" w:eastAsia="黑体"/>
+          <w:b/>
+          <w:sz w:val="18"/>
+        </w:rPr>
+        <w:t>表 4-2 当前中风险登记</w:t>
       </w:r>
     </w:p>
     <w:tbl>
@@ -3128,7 +4189,7 @@
                 <w:b w:val="0"/>
                 <w:sz w:val="15"/>
               </w:rPr>
-              <w:t>RR-03 数据/映射</w:t>
+              <w:t>RR-12 H5/兼容</w:t>
             </w:r>
           </w:p>
         </w:tc>
@@ -3149,7 +4210,7 @@
                 <w:b w:val="0"/>
                 <w:sz w:val="15"/>
               </w:rPr>
-              <w:t>八类外部端口字段、枚举、时间与错误语义漂移；以版本化映射、未知字段隔离、契约差异门禁控制</w:t>
+              <w:t>宿主版本、弱网、定位/扫码权限差异导致移动端失败；确认矩阵并覆盖权限拒绝、切后台和弱网</w:t>
             </w:r>
           </w:p>
         </w:tc>
@@ -3170,7 +4231,7 @@
                 <w:b w:val="0"/>
                 <w:sz w:val="15"/>
               </w:rPr>
-              <w:t>3/4/12 高</w:t>
+              <w:t>3/3/9 中</w:t>
             </w:r>
           </w:p>
         </w:tc>
@@ -3212,7 +4273,7 @@
                 <w:b w:val="0"/>
                 <w:sz w:val="15"/>
               </w:rPr>
-              <w:t>映射失败或破坏性变更触发；每周；八端口契约及异常用例通过后关闭</w:t>
+              <w:t>目标宿主关键流程失败；每两周；确认矩阵全通过后关闭</w:t>
             </w:r>
           </w:p>
         </w:tc>
@@ -3235,7 +4296,7 @@
                 <w:b w:val="0"/>
                 <w:sz w:val="15"/>
               </w:rPr>
-              <w:t>RR-06 地图/定位</w:t>
+              <w:t>RR-14 人员治理</w:t>
             </w:r>
           </w:p>
         </w:tc>
@@ -3256,7 +4317,7 @@
                 <w:b w:val="0"/>
                 <w:sz w:val="15"/>
               </w:rPr>
-              <w:t>坐标系、楼层、精度或新鲜度未确认导致错误展示/调度；保存源精度并对过期位置降级</w:t>
+              <w:t>关键知识集中或职责冲突导致停滞/误审；通过单一主责、独立 Review、交接清单与受控记录控制</w:t>
             </w:r>
           </w:p>
         </w:tc>
@@ -3277,7 +4338,7 @@
                 <w:b w:val="0"/>
                 <w:sz w:val="15"/>
               </w:rPr>
-              <w:t>3/4/12 高</w:t>
+              <w:t>2/4/8 中</w:t>
             </w:r>
           </w:p>
         </w:tc>
@@ -3298,7 +4359,7 @@
                 <w:b w:val="0"/>
                 <w:sz w:val="15"/>
               </w:rPr>
-              <w:t>B</w:t>
+              <w:t>A</w:t>
             </w:r>
           </w:p>
         </w:tc>
@@ -3319,649 +4380,7 @@
                 <w:b w:val="0"/>
                 <w:sz w:val="15"/>
               </w:rPr>
-              <w:t>偏移、过期仍参与调派触发；每两周；源与展示比对通过后关闭</w:t>
-            </w:r>
-          </w:p>
-        </w:tc>
-      </w:tr>
-      <w:tr>
-        <w:tc>
-          <w:tcPr>
-            <w:tcW w:type="dxa" w:w="1088"/>
-            <w:vAlign w:val="center"/>
-          </w:tcPr>
-          <w:p>
-            <w:pPr>
-              <w:spacing w:after="0" w:line="240" w:lineRule="auto"/>
-              <w:jc w:val="left"/>
-            </w:pPr>
-            <w:r/>
-            <w:r>
-              <w:rPr>
-                <w:rFonts w:ascii="Times New Roman" w:hAnsi="Times New Roman" w:eastAsia="宋体"/>
-                <w:b w:val="0"/>
-                <w:sz w:val="15"/>
-              </w:rPr>
-              <w:t>RR-07 数据质量</w:t>
-            </w:r>
-          </w:p>
-        </w:tc>
-        <w:tc>
-          <w:tcPr>
-            <w:tcW w:type="dxa" w:w="1360"/>
-            <w:vAlign w:val="center"/>
-          </w:tcPr>
-          <w:p>
-            <w:pPr>
-              <w:spacing w:after="0" w:line="240" w:lineRule="auto"/>
-              <w:jc w:val="left"/>
-            </w:pPr>
-            <w:r/>
-            <w:r>
-              <w:rPr>
-                <w:rFonts w:ascii="Times New Roman" w:hAnsi="Times New Roman" w:eastAsia="宋体"/>
-                <w:b w:val="0"/>
-                <w:sz w:val="15"/>
-              </w:rPr>
-              <w:t>组织、人员、点位、物资等源数据不完整或重复，影响调度统计；执行导入校验、主键/引用检查和异常清单</w:t>
-            </w:r>
-          </w:p>
-        </w:tc>
-        <w:tc>
-          <w:tcPr>
-            <w:tcW w:type="dxa" w:w="3265"/>
-            <w:vAlign w:val="center"/>
-          </w:tcPr>
-          <w:p>
-            <w:pPr>
-              <w:spacing w:after="0" w:line="240" w:lineRule="auto"/>
-              <w:jc w:val="left"/>
-            </w:pPr>
-            <w:r/>
-            <w:r>
-              <w:rPr>
-                <w:rFonts w:ascii="Times New Roman" w:hAnsi="Times New Roman" w:eastAsia="宋体"/>
-                <w:b w:val="0"/>
-                <w:sz w:val="15"/>
-              </w:rPr>
-              <w:t>3/4/12 高</w:t>
-            </w:r>
-          </w:p>
-        </w:tc>
-        <w:tc>
-          <w:tcPr>
-            <w:tcW w:type="dxa" w:w="1360"/>
-            <w:vAlign w:val="center"/>
-          </w:tcPr>
-          <w:p>
-            <w:pPr>
-              <w:spacing w:after="0" w:line="240" w:lineRule="auto"/>
-              <w:jc w:val="left"/>
-            </w:pPr>
-            <w:r/>
-            <w:r>
-              <w:rPr>
-                <w:rFonts w:ascii="Times New Roman" w:hAnsi="Times New Roman" w:eastAsia="宋体"/>
-                <w:b w:val="0"/>
-                <w:sz w:val="15"/>
-              </w:rPr>
-              <w:t>C</w:t>
-            </w:r>
-          </w:p>
-        </w:tc>
-        <w:tc>
-          <w:tcPr>
-            <w:tcW w:type="dxa" w:w="1995"/>
-            <w:vAlign w:val="center"/>
-          </w:tcPr>
-          <w:p>
-            <w:pPr>
-              <w:spacing w:after="0" w:line="240" w:lineRule="auto"/>
-              <w:jc w:val="left"/>
-            </w:pPr>
-            <w:r/>
-            <w:r>
-              <w:rPr>
-                <w:rFonts w:ascii="Times New Roman" w:hAnsi="Times New Roman" w:eastAsia="宋体"/>
-                <w:b w:val="0"/>
-                <w:sz w:val="15"/>
-              </w:rPr>
-              <w:t>完整率或唯一性检查失败；每两周；受控样本导入与对账通过后关闭</w:t>
-            </w:r>
-          </w:p>
-        </w:tc>
-      </w:tr>
-      <w:tr>
-        <w:tc>
-          <w:tcPr>
-            <w:tcW w:type="dxa" w:w="1088"/>
-            <w:vAlign w:val="center"/>
-          </w:tcPr>
-          <w:p>
-            <w:pPr>
-              <w:spacing w:after="0" w:line="240" w:lineRule="auto"/>
-              <w:jc w:val="left"/>
-            </w:pPr>
-            <w:r/>
-            <w:r>
-              <w:rPr>
-                <w:rFonts w:ascii="Times New Roman" w:hAnsi="Times New Roman" w:eastAsia="宋体"/>
-                <w:b w:val="0"/>
-                <w:sz w:val="15"/>
-              </w:rPr>
-              <w:t>RR-10 部署/恢复</w:t>
-            </w:r>
-          </w:p>
-        </w:tc>
-        <w:tc>
-          <w:tcPr>
-            <w:tcW w:type="dxa" w:w="1360"/>
-            <w:vAlign w:val="center"/>
-          </w:tcPr>
-          <w:p>
-            <w:pPr>
-              <w:spacing w:after="0" w:line="240" w:lineRule="auto"/>
-              <w:jc w:val="left"/>
-            </w:pPr>
-            <w:r/>
-            <w:r>
-              <w:rPr>
-                <w:rFonts w:ascii="Times New Roman" w:hAnsi="Times New Roman" w:eastAsia="宋体"/>
-                <w:b w:val="0"/>
-                <w:sz w:val="15"/>
-              </w:rPr>
-              <w:t>私有化资源、备份恢复或回滚未验证，可能延长中断；通过外置配置、迁移/回滚脚本和恢复演练控制</w:t>
-            </w:r>
-          </w:p>
-        </w:tc>
-        <w:tc>
-          <w:tcPr>
-            <w:tcW w:type="dxa" w:w="3265"/>
-            <w:vAlign w:val="center"/>
-          </w:tcPr>
-          <w:p>
-            <w:pPr>
-              <w:spacing w:after="0" w:line="240" w:lineRule="auto"/>
-              <w:jc w:val="left"/>
-            </w:pPr>
-            <w:r/>
-            <w:r>
-              <w:rPr>
-                <w:rFonts w:ascii="Times New Roman" w:hAnsi="Times New Roman" w:eastAsia="宋体"/>
-                <w:b w:val="0"/>
-                <w:sz w:val="15"/>
-              </w:rPr>
-              <w:t>3/4/12 高</w:t>
-            </w:r>
-          </w:p>
-        </w:tc>
-        <w:tc>
-          <w:tcPr>
-            <w:tcW w:type="dxa" w:w="1360"/>
-            <w:vAlign w:val="center"/>
-          </w:tcPr>
-          <w:p>
-            <w:pPr>
-              <w:spacing w:after="0" w:line="240" w:lineRule="auto"/>
-              <w:jc w:val="left"/>
-            </w:pPr>
-            <w:r/>
-            <w:r>
-              <w:rPr>
-                <w:rFonts w:ascii="Times New Roman" w:hAnsi="Times New Roman" w:eastAsia="宋体"/>
-                <w:b w:val="0"/>
-                <w:sz w:val="15"/>
-              </w:rPr>
-              <w:t>B</w:t>
-            </w:r>
-          </w:p>
-        </w:tc>
-        <w:tc>
-          <w:tcPr>
-            <w:tcW w:type="dxa" w:w="1995"/>
-            <w:vAlign w:val="center"/>
-          </w:tcPr>
-          <w:p>
-            <w:pPr>
-              <w:spacing w:after="0" w:line="240" w:lineRule="auto"/>
-              <w:jc w:val="left"/>
-            </w:pPr>
-            <w:r/>
-            <w:r>
-              <w:rPr>
-                <w:rFonts w:ascii="Times New Roman" w:hAnsi="Times New Roman" w:eastAsia="宋体"/>
-                <w:b w:val="0"/>
-                <w:sz w:val="15"/>
-              </w:rPr>
-              <w:t>干净部署或恢复演练失败；每周；独立部署、回滚和恢复演练通过后关闭</w:t>
-            </w:r>
-          </w:p>
-        </w:tc>
-      </w:tr>
-      <w:tr>
-        <w:tc>
-          <w:tcPr>
-            <w:tcW w:type="dxa" w:w="1088"/>
-            <w:vAlign w:val="center"/>
-          </w:tcPr>
-          <w:p>
-            <w:pPr>
-              <w:spacing w:after="0" w:line="240" w:lineRule="auto"/>
-              <w:jc w:val="left"/>
-            </w:pPr>
-            <w:r/>
-            <w:r>
-              <w:rPr>
-                <w:rFonts w:ascii="Times New Roman" w:hAnsi="Times New Roman" w:eastAsia="宋体"/>
-                <w:b w:val="0"/>
-                <w:sz w:val="15"/>
-              </w:rPr>
-              <w:t>RR-11 范围/变更</w:t>
-            </w:r>
-          </w:p>
-        </w:tc>
-        <w:tc>
-          <w:tcPr>
-            <w:tcW w:type="dxa" w:w="1360"/>
-            <w:vAlign w:val="center"/>
-          </w:tcPr>
-          <w:p>
-            <w:pPr>
-              <w:spacing w:after="0" w:line="240" w:lineRule="auto"/>
-              <w:jc w:val="left"/>
-            </w:pPr>
-            <w:r/>
-            <w:r>
-              <w:rPr>
-                <w:rFonts w:ascii="Times New Roman" w:hAnsi="Times New Roman" w:eastAsia="宋体"/>
-                <w:b w:val="0"/>
-                <w:sz w:val="15"/>
-              </w:rPr>
-              <w:t>未经评估的需求扩张可能冲击冻结范围和验收；所有变化进入 CR/CCB 和影响分析</w:t>
-            </w:r>
-          </w:p>
-        </w:tc>
-        <w:tc>
-          <w:tcPr>
-            <w:tcW w:type="dxa" w:w="3265"/>
-            <w:vAlign w:val="center"/>
-          </w:tcPr>
-          <w:p>
-            <w:pPr>
-              <w:spacing w:after="0" w:line="240" w:lineRule="auto"/>
-              <w:jc w:val="left"/>
-            </w:pPr>
-            <w:r/>
-            <w:r>
-              <w:rPr>
-                <w:rFonts w:ascii="Times New Roman" w:hAnsi="Times New Roman" w:eastAsia="宋体"/>
-                <w:b w:val="0"/>
-                <w:sz w:val="15"/>
-              </w:rPr>
-              <w:t>3/4/12 高</w:t>
-            </w:r>
-          </w:p>
-        </w:tc>
-        <w:tc>
-          <w:tcPr>
-            <w:tcW w:type="dxa" w:w="1360"/>
-            <w:vAlign w:val="center"/>
-          </w:tcPr>
-          <w:p>
-            <w:pPr>
-              <w:spacing w:after="0" w:line="240" w:lineRule="auto"/>
-              <w:jc w:val="left"/>
-            </w:pPr>
-            <w:r/>
-            <w:r>
-              <w:rPr>
-                <w:rFonts w:ascii="Times New Roman" w:hAnsi="Times New Roman" w:eastAsia="宋体"/>
-                <w:b w:val="0"/>
-                <w:sz w:val="15"/>
-              </w:rPr>
-              <w:t>A</w:t>
-            </w:r>
-          </w:p>
-        </w:tc>
-        <w:tc>
-          <w:tcPr>
-            <w:tcW w:type="dxa" w:w="1995"/>
-            <w:vAlign w:val="center"/>
-          </w:tcPr>
-          <w:p>
-            <w:pPr>
-              <w:spacing w:after="0" w:line="240" w:lineRule="auto"/>
-              <w:jc w:val="left"/>
-            </w:pPr>
-            <w:r/>
-            <w:r>
-              <w:rPr>
-                <w:rFonts w:ascii="Times New Roman" w:hAnsi="Times New Roman" w:eastAsia="宋体"/>
-                <w:b w:val="0"/>
-                <w:sz w:val="15"/>
-              </w:rPr>
-              <w:t>口头新增、FR/AC/数字拟变更；每周；变更获批或拒绝并同步受控项后关闭</w:t>
-            </w:r>
-          </w:p>
-        </w:tc>
-      </w:tr>
-      <w:tr>
-        <w:tc>
-          <w:tcPr>
-            <w:tcW w:type="dxa" w:w="1088"/>
-            <w:vAlign w:val="center"/>
-          </w:tcPr>
-          <w:p>
-            <w:pPr>
-              <w:spacing w:after="0" w:line="240" w:lineRule="auto"/>
-              <w:jc w:val="left"/>
-            </w:pPr>
-            <w:r/>
-            <w:r>
-              <w:rPr>
-                <w:rFonts w:ascii="Times New Roman" w:hAnsi="Times New Roman" w:eastAsia="宋体"/>
-                <w:b w:val="0"/>
-                <w:sz w:val="15"/>
-              </w:rPr>
-              <w:t>RR-12 H5/兼容</w:t>
-            </w:r>
-          </w:p>
-        </w:tc>
-        <w:tc>
-          <w:tcPr>
-            <w:tcW w:type="dxa" w:w="1360"/>
-            <w:vAlign w:val="center"/>
-          </w:tcPr>
-          <w:p>
-            <w:pPr>
-              <w:spacing w:after="0" w:line="240" w:lineRule="auto"/>
-              <w:jc w:val="left"/>
-            </w:pPr>
-            <w:r/>
-            <w:r>
-              <w:rPr>
-                <w:rFonts w:ascii="Times New Roman" w:hAnsi="Times New Roman" w:eastAsia="宋体"/>
-                <w:b w:val="0"/>
-                <w:sz w:val="15"/>
-              </w:rPr>
-              <w:t>宿主版本、弱网、定位/扫码权限差异导致移动端失败；确认矩阵并覆盖权限拒绝、切后台和弱网</w:t>
-            </w:r>
-          </w:p>
-        </w:tc>
-        <w:tc>
-          <w:tcPr>
-            <w:tcW w:type="dxa" w:w="3265"/>
-            <w:vAlign w:val="center"/>
-          </w:tcPr>
-          <w:p>
-            <w:pPr>
-              <w:spacing w:after="0" w:line="240" w:lineRule="auto"/>
-              <w:jc w:val="left"/>
-            </w:pPr>
-            <w:r/>
-            <w:r>
-              <w:rPr>
-                <w:rFonts w:ascii="Times New Roman" w:hAnsi="Times New Roman" w:eastAsia="宋体"/>
-                <w:b w:val="0"/>
-                <w:sz w:val="15"/>
-              </w:rPr>
-              <w:t>3/3/9 中</w:t>
-            </w:r>
-          </w:p>
-        </w:tc>
-        <w:tc>
-          <w:tcPr>
-            <w:tcW w:type="dxa" w:w="1360"/>
-            <w:vAlign w:val="center"/>
-          </w:tcPr>
-          <w:p>
-            <w:pPr>
-              <w:spacing w:after="0" w:line="240" w:lineRule="auto"/>
-              <w:jc w:val="left"/>
-            </w:pPr>
-            <w:r/>
-            <w:r>
-              <w:rPr>
-                <w:rFonts w:ascii="Times New Roman" w:hAnsi="Times New Roman" w:eastAsia="宋体"/>
-                <w:b w:val="0"/>
-                <w:sz w:val="15"/>
-              </w:rPr>
-              <w:t>B</w:t>
-            </w:r>
-          </w:p>
-        </w:tc>
-        <w:tc>
-          <w:tcPr>
-            <w:tcW w:type="dxa" w:w="1995"/>
-            <w:vAlign w:val="center"/>
-          </w:tcPr>
-          <w:p>
-            <w:pPr>
-              <w:spacing w:after="0" w:line="240" w:lineRule="auto"/>
-              <w:jc w:val="left"/>
-            </w:pPr>
-            <w:r/>
-            <w:r>
-              <w:rPr>
-                <w:rFonts w:ascii="Times New Roman" w:hAnsi="Times New Roman" w:eastAsia="宋体"/>
-                <w:b w:val="0"/>
-                <w:sz w:val="15"/>
-              </w:rPr>
-              <w:t>目标宿主关键流程失败；每两周；确认矩阵全通过后关闭</w:t>
-            </w:r>
-          </w:p>
-        </w:tc>
-      </w:tr>
-      <w:tr>
-        <w:tc>
-          <w:tcPr>
-            <w:tcW w:type="dxa" w:w="1088"/>
-            <w:vAlign w:val="center"/>
-          </w:tcPr>
-          <w:p>
-            <w:pPr>
-              <w:spacing w:after="0" w:line="240" w:lineRule="auto"/>
-              <w:jc w:val="left"/>
-            </w:pPr>
-            <w:r/>
-            <w:r>
-              <w:rPr>
-                <w:rFonts w:ascii="Times New Roman" w:hAnsi="Times New Roman" w:eastAsia="宋体"/>
-                <w:b w:val="0"/>
-                <w:sz w:val="15"/>
-              </w:rPr>
-              <w:t>RR-14 人员治理</w:t>
-            </w:r>
-          </w:p>
-        </w:tc>
-        <w:tc>
-          <w:tcPr>
-            <w:tcW w:type="dxa" w:w="1360"/>
-            <w:vAlign w:val="center"/>
-          </w:tcPr>
-          <w:p>
-            <w:pPr>
-              <w:spacing w:after="0" w:line="240" w:lineRule="auto"/>
-              <w:jc w:val="left"/>
-            </w:pPr>
-            <w:r/>
-            <w:r>
-              <w:rPr>
-                <w:rFonts w:ascii="Times New Roman" w:hAnsi="Times New Roman" w:eastAsia="宋体"/>
-                <w:b w:val="0"/>
-                <w:sz w:val="15"/>
-              </w:rPr>
-              <w:t>关键知识集中或职责冲突导致停滞/误审；通过单一主责、独立 Review、交接清单与受控记录控制</w:t>
-            </w:r>
-          </w:p>
-        </w:tc>
-        <w:tc>
-          <w:tcPr>
-            <w:tcW w:type="dxa" w:w="3265"/>
-            <w:vAlign w:val="center"/>
-          </w:tcPr>
-          <w:p>
-            <w:pPr>
-              <w:spacing w:after="0" w:line="240" w:lineRule="auto"/>
-              <w:jc w:val="left"/>
-            </w:pPr>
-            <w:r/>
-            <w:r>
-              <w:rPr>
-                <w:rFonts w:ascii="Times New Roman" w:hAnsi="Times New Roman" w:eastAsia="宋体"/>
-                <w:b w:val="0"/>
-                <w:sz w:val="15"/>
-              </w:rPr>
-              <w:t>2/4/8 中</w:t>
-            </w:r>
-          </w:p>
-        </w:tc>
-        <w:tc>
-          <w:tcPr>
-            <w:tcW w:type="dxa" w:w="1360"/>
-            <w:vAlign w:val="center"/>
-          </w:tcPr>
-          <w:p>
-            <w:pPr>
-              <w:spacing w:after="0" w:line="240" w:lineRule="auto"/>
-              <w:jc w:val="left"/>
-            </w:pPr>
-            <w:r/>
-            <w:r>
-              <w:rPr>
-                <w:rFonts w:ascii="Times New Roman" w:hAnsi="Times New Roman" w:eastAsia="宋体"/>
-                <w:b w:val="0"/>
-                <w:sz w:val="15"/>
-              </w:rPr>
-              <w:t>A</w:t>
-            </w:r>
-          </w:p>
-        </w:tc>
-        <w:tc>
-          <w:tcPr>
-            <w:tcW w:type="dxa" w:w="1995"/>
-            <w:vAlign w:val="center"/>
-          </w:tcPr>
-          <w:p>
-            <w:pPr>
-              <w:spacing w:after="0" w:line="240" w:lineRule="auto"/>
-              <w:jc w:val="left"/>
-            </w:pPr>
-            <w:r/>
-            <w:r>
-              <w:rPr>
-                <w:rFonts w:ascii="Times New Roman" w:hAnsi="Times New Roman" w:eastAsia="宋体"/>
-                <w:b w:val="0"/>
-                <w:sz w:val="15"/>
-              </w:rPr>
               <w:t>主责缺席或同人自审；每两周；替补可按记录完成演练后关闭</w:t>
-            </w:r>
-          </w:p>
-        </w:tc>
-      </w:tr>
-      <w:tr>
-        <w:tc>
-          <w:tcPr>
-            <w:tcW w:type="dxa" w:w="1088"/>
-            <w:vAlign w:val="center"/>
-          </w:tcPr>
-          <w:p>
-            <w:pPr>
-              <w:spacing w:after="0" w:line="240" w:lineRule="auto"/>
-              <w:jc w:val="left"/>
-            </w:pPr>
-            <w:r/>
-            <w:r>
-              <w:rPr>
-                <w:rFonts w:ascii="Times New Roman" w:hAnsi="Times New Roman" w:eastAsia="宋体"/>
-                <w:b w:val="0"/>
-                <w:sz w:val="15"/>
-              </w:rPr>
-              <w:t>RR-15 AI/证据</w:t>
-            </w:r>
-          </w:p>
-        </w:tc>
-        <w:tc>
-          <w:tcPr>
-            <w:tcW w:type="dxa" w:w="1360"/>
-            <w:vAlign w:val="center"/>
-          </w:tcPr>
-          <w:p>
-            <w:pPr>
-              <w:spacing w:after="0" w:line="240" w:lineRule="auto"/>
-              <w:jc w:val="left"/>
-            </w:pPr>
-            <w:r/>
-            <w:r>
-              <w:rPr>
-                <w:rFonts w:ascii="Times New Roman" w:hAnsi="Times New Roman" w:eastAsia="宋体"/>
-                <w:b w:val="0"/>
-                <w:sz w:val="15"/>
-              </w:rPr>
-              <w:t>AI 生成内容可能引入未证实事实或把 Mock 写成实测；通过来源优先级、Prompt/输出日志、机械检查与人工 Review 控制</w:t>
-            </w:r>
-          </w:p>
-        </w:tc>
-        <w:tc>
-          <w:tcPr>
-            <w:tcW w:type="dxa" w:w="3265"/>
-            <w:vAlign w:val="center"/>
-          </w:tcPr>
-          <w:p>
-            <w:pPr>
-              <w:spacing w:after="0" w:line="240" w:lineRule="auto"/>
-              <w:jc w:val="left"/>
-            </w:pPr>
-            <w:r/>
-            <w:r>
-              <w:rPr>
-                <w:rFonts w:ascii="Times New Roman" w:hAnsi="Times New Roman" w:eastAsia="宋体"/>
-                <w:b w:val="0"/>
-                <w:sz w:val="15"/>
-              </w:rPr>
-              <w:t>3/4/12 高</w:t>
-            </w:r>
-          </w:p>
-        </w:tc>
-        <w:tc>
-          <w:tcPr>
-            <w:tcW w:type="dxa" w:w="1360"/>
-            <w:vAlign w:val="center"/>
-          </w:tcPr>
-          <w:p>
-            <w:pPr>
-              <w:spacing w:after="0" w:line="240" w:lineRule="auto"/>
-              <w:jc w:val="left"/>
-            </w:pPr>
-            <w:r/>
-            <w:r>
-              <w:rPr>
-                <w:rFonts w:ascii="Times New Roman" w:hAnsi="Times New Roman" w:eastAsia="宋体"/>
-                <w:b w:val="0"/>
-                <w:sz w:val="15"/>
-              </w:rPr>
-              <w:t>C</w:t>
-            </w:r>
-          </w:p>
-        </w:tc>
-        <w:tc>
-          <w:tcPr>
-            <w:tcW w:type="dxa" w:w="1995"/>
-            <w:vAlign w:val="center"/>
-          </w:tcPr>
-          <w:p>
-            <w:pPr>
-              <w:spacing w:after="0" w:line="240" w:lineRule="auto"/>
-              <w:jc w:val="left"/>
-            </w:pPr>
-            <w:r/>
-            <w:r>
-              <w:rPr>
-                <w:rFonts w:ascii="Times New Roman" w:hAnsi="Times New Roman" w:eastAsia="宋体"/>
-                <w:b w:val="0"/>
-                <w:sz w:val="15"/>
-              </w:rPr>
-              <w:t>无来源数字、虚构验证或日志缺失；每周；抽查无未证实结论且证据链完整后关闭</w:t>
             </w:r>
           </w:p>
         </w:tc>
@@ -3978,7 +4397,7 @@
           <w:rFonts w:ascii="Times New Roman" w:hAnsi="Times New Roman" w:eastAsia="宋体"/>
           <w:sz w:val="21"/>
         </w:rPr>
-        <w:t>极高/高风险至少每周复核，中风险至少每两周，低风险至少每月；触发器、Issue/缺陷、测试失败、外部条件变化或里程碑前均立即复核。责任人更新 P/I、趋势、证据、行动与到期项，A 汇总风险状态报告。</w:t>
+        <w:t>当前登记册无 1—4 分低风险；后续新增低风险仍按 §5 的月度周期持续监测，不得为填充分组而虚构风险。</w:t>
       </w:r>
     </w:p>
     <w:p>
@@ -3992,7 +4411,7 @@
           <w:rFonts w:ascii="Times New Roman" w:hAnsi="Times New Roman" w:eastAsia="宋体"/>
           <w:sz w:val="21"/>
         </w:rPr>
-        <w:t>应对按四层执行：预防降低发生概率；缓解降低影响；应急在触发后维持业务与证据完整；升级用于跨职责、基线、预算/工期、★、安全或甲方依赖事项。任何应急措施不得静默降低验收标准或扩大乙方责任。</w:t>
+        <w:t>极高/高风险至少每周复核，中风险至少每两周，低风险至少每月；触发器、Issue/缺陷、测试失败、外部条件变化或里程碑前均立即复核。责任人更新 P/I、趋势、证据、行动与到期项，A 汇总风险状态报告。</w:t>
       </w:r>
     </w:p>
     <w:p>
@@ -4006,7 +4425,36 @@
           <w:rFonts w:ascii="Times New Roman" w:hAnsi="Times New Roman" w:eastAsia="宋体"/>
           <w:sz w:val="21"/>
         </w:rPr>
+        <w:t>应对按四层执行：预防降低发生概率；缓解降低影响；应急在触发后维持业务与证据完整；升级用于跨职责、基线、预算/工期、★、安全或甲方依赖事项。任何应急措施不得静默降低验收标准或扩大乙方责任。</w:t>
+      </w:r>
+    </w:p>
+    <w:p>
+      <w:pPr>
+        <w:spacing w:after="100" w:line="300" w:lineRule="auto"/>
+        <w:ind w:firstLine="480"/>
+        <w:jc w:val="both"/>
+      </w:pPr>
+      <w:r>
+        <w:rPr>
+          <w:rFonts w:ascii="Times New Roman" w:hAnsi="Times New Roman" w:eastAsia="宋体"/>
+          <w:sz w:val="21"/>
+        </w:rPr>
         <w:t>受控验收语义为：Given 用户选择有权限的视频点位，When 发起实时调阅，Then 系统通过既有接口请求并展示实时画面或明确失败原因。</w:t>
+      </w:r>
+    </w:p>
+    <w:p>
+      <w:pPr>
+        <w:keepNext/>
+        <w:spacing w:before="80" w:after="60"/>
+        <w:jc w:val="center"/>
+      </w:pPr>
+      <w:r>
+        <w:rPr>
+          <w:rFonts w:ascii="Times New Roman" w:hAnsi="Times New Roman" w:eastAsia="黑体"/>
+          <w:b/>
+          <w:sz w:val="18"/>
+        </w:rPr>
+        <w:t>表 6-1 AC-G2-FR-006-01 风险控制核对</w:t>
       </w:r>
     </w:p>
     <w:tbl>
@@ -4469,6 +4917,21 @@
         <w:t>专项结论：验收点未被更改；RR-05 明确了责任人、触发器、应对、复核周期和关闭条件。现阶段不能以接口设计、Mock 或文档审计代替真实视频联调与首帧证据。</w:t>
       </w:r>
     </w:p>
+    <w:p>
+      <w:pPr>
+        <w:keepNext/>
+        <w:spacing w:before="80" w:after="60"/>
+        <w:jc w:val="center"/>
+      </w:pPr>
+      <w:r>
+        <w:rPr>
+          <w:rFonts w:ascii="Times New Roman" w:hAnsi="Times New Roman" w:eastAsia="黑体"/>
+          <w:b/>
+          <w:sz w:val="18"/>
+        </w:rPr>
+        <w:t>表 7-1 风险与 Issue、变更、测试及配置闭环</w:t>
+      </w:r>
+    </w:p>
     <w:tbl>
       <w:tblPr>
         <w:tblW w:type="auto" w:w="0"/>
@@ -4837,6 +5300,21 @@
         <w:t>风险状态报告至少包含新增/关闭/升级风险、P/I 趋势、已触发事项、逾期行动、关联 Issue/CR/缺陷、门禁影响和所需决策。关闭必须同时满足：触发源已消除或降至可接受水平；预防/缓解/应急措施已验证；关联 Issue/缺陷/CR 已按各自流程闭环；无未转移残余风险；B 对本计划的 Review 结论已记录。仅“当前未发生”不能作为关闭理由。</w:t>
       </w:r>
     </w:p>
+    <w:p>
+      <w:pPr>
+        <w:keepNext/>
+        <w:spacing w:before="80" w:after="60"/>
+        <w:jc w:val="center"/>
+      </w:pPr>
+      <w:r>
+        <w:rPr>
+          <w:rFonts w:ascii="Times New Roman" w:hAnsi="Times New Roman" w:eastAsia="黑体"/>
+          <w:b/>
+          <w:sz w:val="18"/>
+        </w:rPr>
+        <w:t>表 9-1 G3-14 主责整改自检</w:t>
+      </w:r>
+    </w:p>
     <w:tbl>
       <w:tblPr>
         <w:tblW w:type="auto" w:w="0"/>
@@ -4933,7 +5411,7 @@
                 <w:b w:val="0"/>
                 <w:sz w:val="17"/>
               </w:rPr>
-              <w:t>PASS：覆盖外部依赖、接口、NFR、进度、质量、配置与发布</w:t>
+              <w:t>PASS：16 项 P×I 与等级一致；极高/高/中按阈值分组，当前无低风险</w:t>
             </w:r>
           </w:p>
         </w:tc>
@@ -5109,7 +5587,7 @@
                 <w:b w:val="0"/>
                 <w:sz w:val="17"/>
               </w:rPr>
-              <w:t>PASS：A 主责自检完成，下一步仅由 B Review；评审前保持候选</w:t>
+              <w:t>PASS：已按 ISSUE-G3-14-001/002 整改，下一步仅由 B 复验；复验前保持候选</w:t>
             </w:r>
           </w:p>
         </w:tc>

</xml_diff>